<commit_message>
fix(KexDll): fix a bug where KEX_DllRewriteEntries didn't work properly refactor(KexDll): refactor KexVtblPatch*
RELATED TO #6
</commit_message>
<xml_diff>
--- a/00-Documentation/VxKex Registry Keys.docx
+++ b/00-Documentation/VxKex Registry Keys.docx
@@ -1,10 +1,18 @@
 
 <file path=word/document.xml><?xml version="1.0" encoding="utf-8"?>
-<w:document xmlns:wpc="http://schemas.microsoft.com/office/word/2010/wordprocessingCanvas" xmlns:mc="http://schemas.openxmlformats.org/markup-compatibility/2006" xmlns:o="urn:schemas-microsoft-com:office:office" xmlns:r="http://schemas.openxmlformats.org/officeDocument/2006/relationships" xmlns:m="http://schemas.openxmlformats.org/officeDocument/2006/math" xmlns:v="urn:schemas-microsoft-com:vml" xmlns:wp14="http://schemas.microsoft.com/office/word/2010/wordprocessingDrawing" xmlns:wp="http://schemas.openxmlformats.org/drawingml/2006/wordprocessingDrawing" xmlns:w10="urn:schemas-microsoft-com:office:word" xmlns:w="http://schemas.openxmlformats.org/wordprocessingml/2006/main" xmlns:w14="http://schemas.microsoft.com/office/word/2010/wordml" xmlns:wpg="http://schemas.microsoft.com/office/word/2010/wordprocessingGroup" xmlns:wpi="http://schemas.microsoft.com/office/word/2010/wordprocessingInk" xmlns:wne="http://schemas.microsoft.com/office/word/2006/wordml" xmlns:wps="http://schemas.microsoft.com/office/word/2010/wordprocessingShape" mc:Ignorable="w14 wp14">
+<w:document xmlns:wpc="http://schemas.microsoft.com/office/word/2010/wordprocessingCanvas" xmlns:cx="http://schemas.microsoft.com/office/drawing/2014/chartex" xmlns:cx1="http://schemas.microsoft.com/office/drawing/2015/9/8/chartex" xmlns:cx2="http://schemas.microsoft.com/office/drawing/2015/10/21/chartex" xmlns:cx3="http://schemas.microsoft.com/office/drawing/2016/5/9/chartex" xmlns:cx4="http://schemas.microsoft.com/office/drawing/2016/5/10/chartex" xmlns:cx5="http://schemas.microsoft.com/office/drawing/2016/5/11/chartex" xmlns:cx6="http://schemas.microsoft.com/office/drawing/2016/5/12/chartex" xmlns:cx7="http://schemas.microsoft.com/office/drawing/2016/5/13/chartex" xmlns:cx8="http://schemas.microsoft.com/office/drawing/2016/5/14/chartex" xmlns:mc="http://schemas.openxmlformats.org/markup-compatibility/2006" xmlns:aink="http://schemas.microsoft.com/office/drawing/2016/ink" xmlns:am3d="http://schemas.microsoft.com/office/drawing/2017/model3d" xmlns:o="urn:schemas-microsoft-com:office:office" xmlns:r="http://schemas.openxmlformats.org/officeDocument/2006/relationships" xmlns:m="http://schemas.openxmlformats.org/officeDocument/2006/math" xmlns:v="urn:schemas-microsoft-com:vml" xmlns:wp14="http://schemas.microsoft.com/office/word/2010/wordprocessingDrawing" xmlns:wp="http://schemas.openxmlformats.org/drawingml/2006/wordprocessingDrawing" xmlns:w10="urn:schemas-microsoft-com:office:word" xmlns:w="http://schemas.openxmlformats.org/wordprocessingml/2006/main" xmlns:w14="http://schemas.microsoft.com/office/word/2010/wordml" xmlns:w15="http://schemas.microsoft.com/office/word/2012/wordml" xmlns:w16cid="http://schemas.microsoft.com/office/word/2016/wordml/cid" xmlns:w16se="http://schemas.microsoft.com/office/word/2015/wordml/symex" xmlns:wpg="http://schemas.microsoft.com/office/word/2010/wordprocessingGroup" xmlns:wpi="http://schemas.microsoft.com/office/word/2010/wordprocessingInk" xmlns:wne="http://schemas.microsoft.com/office/word/2006/wordml" xmlns:wps="http://schemas.microsoft.com/office/word/2010/wordprocessingShape" mc:Ignorable="w14 w15 w16se w16cid wp14">
   <w:body>
     <w:p>
       <w:r>
-        <w:t>This document lists all the registry keys used by post-rewrite versions of VxKex.</w:t>
+        <w:t xml:space="preserve">This document lists all the registry keys used by post-rewrite versions of </w:t>
+      </w:r>
+      <w:proofErr w:type="spellStart"/>
+      <w:r>
+        <w:t>VxKex</w:t>
+      </w:r>
+      <w:proofErr w:type="spellEnd"/>
+      <w:r>
+        <w:t>.</w:t>
       </w:r>
       <w:r>
         <w:t xml:space="preserve"> Keys which are marked with </w:t>
@@ -16,24 +24,62 @@
         <w:t xml:space="preserve">(•) </w:t>
       </w:r>
       <w:r>
-        <w:t xml:space="preserve">are considered owned by VxKex, and their values and subkeys </w:t>
-      </w:r>
-      <w:r>
-        <w:t>may be deleted or changed without consideration for the system or other applications. Such keys must be deleted when VxKex is uninstalled.</w:t>
-      </w:r>
-    </w:p>
-    <w:p>
-      <w:pPr>
-        <w:rPr>
-          <w:b/>
-        </w:rPr>
-      </w:pPr>
-      <w:r>
-        <w:rPr>
-          <w:b/>
-        </w:rPr>
-        <w:t>HKEY_LOCAL_MACHINE\Software\VXsoft\VxKex</w:t>
-      </w:r>
+        <w:t xml:space="preserve">are considered owned by </w:t>
+      </w:r>
+      <w:proofErr w:type="spellStart"/>
+      <w:r>
+        <w:t>VxKex</w:t>
+      </w:r>
+      <w:proofErr w:type="spellEnd"/>
+      <w:r>
+        <w:t xml:space="preserve">, and their values and subkeys </w:t>
+      </w:r>
+      <w:r>
+        <w:t xml:space="preserve">may be deleted or changed without consideration for the system or other applications. Such keys must be deleted when </w:t>
+      </w:r>
+      <w:proofErr w:type="spellStart"/>
+      <w:r>
+        <w:t>VxKex</w:t>
+      </w:r>
+      <w:proofErr w:type="spellEnd"/>
+      <w:r>
+        <w:t xml:space="preserve"> is uninstalled.</w:t>
+      </w:r>
+    </w:p>
+    <w:p>
+      <w:pPr>
+        <w:rPr>
+          <w:b/>
+        </w:rPr>
+      </w:pPr>
+      <w:r>
+        <w:rPr>
+          <w:b/>
+        </w:rPr>
+        <w:t>HKEY_LOCAL_MACHINE\Software\</w:t>
+      </w:r>
+      <w:proofErr w:type="spellStart"/>
+      <w:r>
+        <w:rPr>
+          <w:b/>
+        </w:rPr>
+        <w:t>VXsoft</w:t>
+      </w:r>
+      <w:proofErr w:type="spellEnd"/>
+      <w:r>
+        <w:rPr>
+          <w:b/>
+        </w:rPr>
+        <w:t>\</w:t>
+      </w:r>
+      <w:proofErr w:type="spellStart"/>
+      <w:r>
+        <w:rPr>
+          <w:b/>
+        </w:rPr>
+        <w:t>VxKex</w:t>
+      </w:r>
+      <w:proofErr w:type="spellEnd"/>
       <w:r>
         <w:rPr>
           <w:b/>
@@ -43,18 +89,20 @@
     </w:p>
     <w:p>
       <w:pPr>
-        <w:pStyle w:val="ListParagraph"/>
+        <w:pStyle w:val="a3"/>
         <w:numPr>
           <w:ilvl w:val="0"/>
           <w:numId w:val="1"/>
         </w:numPr>
       </w:pPr>
+      <w:proofErr w:type="spellStart"/>
       <w:r>
         <w:rPr>
           <w:u w:val="single"/>
         </w:rPr>
         <w:t>InstalledVersion</w:t>
       </w:r>
+      <w:proofErr w:type="spellEnd"/>
       <w:r>
         <w:t xml:space="preserve"> (</w:t>
       </w:r>
@@ -71,7 +119,15 @@
         <w:br/>
       </w:r>
       <w:r>
-        <w:t>Contains the version number of the currently installed VxKex.</w:t>
+        <w:t xml:space="preserve">Contains the version number of the currently installed </w:t>
+      </w:r>
+      <w:proofErr w:type="spellStart"/>
+      <w:r>
+        <w:t>VxKex</w:t>
+      </w:r>
+      <w:proofErr w:type="spellEnd"/>
+      <w:r>
+        <w:t>.</w:t>
       </w:r>
       <w:r>
         <w:br/>
@@ -80,18 +136,20 @@
     </w:p>
     <w:p>
       <w:pPr>
-        <w:pStyle w:val="ListParagraph"/>
+        <w:pStyle w:val="a3"/>
         <w:numPr>
           <w:ilvl w:val="0"/>
           <w:numId w:val="1"/>
         </w:numPr>
       </w:pPr>
+      <w:proofErr w:type="spellStart"/>
       <w:r>
         <w:rPr>
           <w:u w:val="single"/>
         </w:rPr>
         <w:t>KexDir</w:t>
       </w:r>
+      <w:proofErr w:type="spellEnd"/>
       <w:r>
         <w:t xml:space="preserve"> (</w:t>
       </w:r>
@@ -111,7 +169,7 @@
     </w:p>
     <w:p>
       <w:pPr>
-        <w:pStyle w:val="ListParagraph"/>
+        <w:pStyle w:val="a3"/>
       </w:pPr>
       <w:r>
         <w:t>There is no trailing backslash.</w:t>
@@ -119,18 +177,20 @@
     </w:p>
     <w:p>
       <w:pPr>
-        <w:pStyle w:val="ListParagraph"/>
+        <w:pStyle w:val="a3"/>
         <w:numPr>
           <w:ilvl w:val="0"/>
           <w:numId w:val="1"/>
         </w:numPr>
       </w:pPr>
+      <w:proofErr w:type="spellStart"/>
       <w:r>
         <w:rPr>
           <w:u w:val="single"/>
         </w:rPr>
         <w:t>LogDir</w:t>
       </w:r>
+      <w:proofErr w:type="spellEnd"/>
       <w:r>
         <w:t xml:space="preserve"> (</w:t>
       </w:r>
@@ -154,18 +214,20 @@
     </w:p>
     <w:p>
       <w:pPr>
-        <w:pStyle w:val="ListParagraph"/>
+        <w:pStyle w:val="a3"/>
         <w:numPr>
           <w:ilvl w:val="0"/>
           <w:numId w:val="1"/>
         </w:numPr>
       </w:pPr>
+      <w:proofErr w:type="spellStart"/>
       <w:r>
         <w:rPr>
           <w:u w:val="single"/>
         </w:rPr>
         <w:t>DisableLogging</w:t>
       </w:r>
+      <w:proofErr w:type="spellEnd"/>
       <w:r>
         <w:t xml:space="preserve"> (</w:t>
       </w:r>
@@ -188,8 +250,30 @@
         <w:rPr>
           <w:b/>
         </w:rPr>
-        <w:t>HKEY_CURRENT_USER\Software\Vxsoft\VxKex</w:t>
-      </w:r>
+        <w:t>HKEY_CURRENT_USER\Software\</w:t>
+      </w:r>
+      <w:proofErr w:type="spellStart"/>
+      <w:r>
+        <w:rPr>
+          <w:b/>
+        </w:rPr>
+        <w:t>Vxsoft</w:t>
+      </w:r>
+      <w:proofErr w:type="spellEnd"/>
+      <w:r>
+        <w:rPr>
+          <w:b/>
+        </w:rPr>
+        <w:t>\</w:t>
+      </w:r>
+      <w:proofErr w:type="spellStart"/>
+      <w:r>
+        <w:rPr>
+          <w:b/>
+        </w:rPr>
+        <w:t>VxKex</w:t>
+      </w:r>
+      <w:proofErr w:type="spellEnd"/>
       <w:r>
         <w:rPr>
           <w:b/>
@@ -199,18 +283,20 @@
     </w:p>
     <w:p>
       <w:pPr>
-        <w:pStyle w:val="ListParagraph"/>
+        <w:pStyle w:val="a3"/>
         <w:numPr>
           <w:ilvl w:val="0"/>
           <w:numId w:val="2"/>
         </w:numPr>
       </w:pPr>
+      <w:proofErr w:type="spellStart"/>
       <w:r>
         <w:rPr>
           <w:u w:val="single"/>
         </w:rPr>
         <w:t>LogDir</w:t>
       </w:r>
+      <w:proofErr w:type="spellEnd"/>
       <w:r>
         <w:t xml:space="preserve"> (</w:t>
       </w:r>
@@ -230,18 +316,20 @@
     </w:p>
     <w:p>
       <w:pPr>
-        <w:pStyle w:val="ListParagraph"/>
+        <w:pStyle w:val="a3"/>
         <w:numPr>
           <w:ilvl w:val="0"/>
           <w:numId w:val="2"/>
         </w:numPr>
       </w:pPr>
+      <w:proofErr w:type="spellStart"/>
       <w:r>
         <w:rPr>
           <w:u w:val="single"/>
         </w:rPr>
         <w:t>DisableLogging</w:t>
       </w:r>
+      <w:proofErr w:type="spellEnd"/>
       <w:r>
         <w:t xml:space="preserve"> (</w:t>
       </w:r>
@@ -274,7 +362,7 @@
     </w:p>
     <w:p>
       <w:pPr>
-        <w:pStyle w:val="ListParagraph"/>
+        <w:pStyle w:val="a3"/>
         <w:numPr>
           <w:ilvl w:val="0"/>
           <w:numId w:val="3"/>
@@ -284,7 +372,21 @@
         <w:rPr>
           <w:u w:val="single"/>
         </w:rPr>
-        <w:t>{VxKexPropagationVirtualKey}</w:t>
+        <w:t>{</w:t>
+      </w:r>
+      <w:proofErr w:type="spellStart"/>
+      <w:r>
+        <w:rPr>
+          <w:u w:val="single"/>
+        </w:rPr>
+        <w:t>VxKexPropagationVirtualKey</w:t>
+      </w:r>
+      <w:proofErr w:type="spellEnd"/>
+      <w:r>
+        <w:rPr>
+          <w:u w:val="single"/>
+        </w:rPr>
+        <w:t>}</w:t>
       </w:r>
       <w:r>
         <w:t xml:space="preserve"> </w:t>
@@ -302,24 +404,48 @@
         <w:br/>
       </w:r>
       <w:r>
-        <w:t>Used during VxKex propagation. The contents are the same as for a normal IFEO key.</w:t>
+        <w:t xml:space="preserve">Used during </w:t>
+      </w:r>
+      <w:proofErr w:type="spellStart"/>
+      <w:r>
+        <w:t>VxKex</w:t>
+      </w:r>
+      <w:proofErr w:type="spellEnd"/>
+      <w:r>
+        <w:t xml:space="preserve"> propagation. The contents are the same as for a normal IFEO key.</w:t>
       </w:r>
       <w:r>
         <w:t xml:space="preserve"> </w:t>
       </w:r>
       <w:r>
-        <w:t>The propagation component inside KexDll substitutes this key for the normal IFEO</w:t>
+        <w:t xml:space="preserve">The propagation component inside </w:t>
+      </w:r>
+      <w:proofErr w:type="spellStart"/>
+      <w:r>
+        <w:t>KexDll</w:t>
+      </w:r>
+      <w:proofErr w:type="spellEnd"/>
+      <w:r>
+        <w:t xml:space="preserve"> substitutes this key for the normal IFEO</w:t>
       </w:r>
       <w:r>
         <w:t xml:space="preserve"> </w:t>
       </w:r>
       <w:r>
-        <w:t>key (see propagte.c).</w:t>
-      </w:r>
-    </w:p>
-    <w:p>
-      <w:pPr>
-        <w:pStyle w:val="ListParagraph"/>
+        <w:t xml:space="preserve">key (see </w:t>
+      </w:r>
+      <w:proofErr w:type="spellStart"/>
+      <w:r>
+        <w:t>propagte.c</w:t>
+      </w:r>
+      <w:proofErr w:type="spellEnd"/>
+      <w:r>
+        <w:t>).</w:t>
+      </w:r>
+    </w:p>
+    <w:p>
+      <w:pPr>
+        <w:pStyle w:val="a3"/>
         <w:numPr>
           <w:ilvl w:val="0"/>
           <w:numId w:val="3"/>
@@ -350,18 +476,20 @@
     </w:p>
     <w:p>
       <w:pPr>
-        <w:pStyle w:val="ListParagraph"/>
+        <w:pStyle w:val="a3"/>
         <w:numPr>
           <w:ilvl w:val="1"/>
           <w:numId w:val="3"/>
         </w:numPr>
       </w:pPr>
+      <w:proofErr w:type="spellStart"/>
       <w:r>
         <w:rPr>
           <w:u w:val="single"/>
         </w:rPr>
         <w:t>UseFilter</w:t>
       </w:r>
+      <w:proofErr w:type="spellEnd"/>
       <w:r>
         <w:t xml:space="preserve"> (</w:t>
       </w:r>
@@ -387,7 +515,15 @@
         <w:t>used in Image File Execution Options is prone to name conflicts, which is why</w:t>
       </w:r>
       <w:r>
-        <w:t xml:space="preserve"> “UseFilter”</w:t>
+        <w:t xml:space="preserve"> “</w:t>
+      </w:r>
+      <w:proofErr w:type="spellStart"/>
+      <w:r>
+        <w:t>UseFilter</w:t>
+      </w:r>
+      <w:proofErr w:type="spellEnd"/>
+      <w:r>
+        <w:t>”</w:t>
       </w:r>
       <w:r>
         <w:t xml:space="preserve"> was added. If this value is present and non-zero, the NTDLL loader</w:t>
@@ -405,7 +541,15 @@
         <w:t xml:space="preserve">will check </w:t>
       </w:r>
       <w:r>
-        <w:t>whether there is a value named “FilterFullPath”</w:t>
+        <w:t>whether there is a value named “</w:t>
+      </w:r>
+      <w:proofErr w:type="spellStart"/>
+      <w:r>
+        <w:t>FilterFullPath</w:t>
+      </w:r>
+      <w:proofErr w:type="spellEnd"/>
+      <w:r>
+        <w:t>”</w:t>
       </w:r>
       <w:r>
         <w:t xml:space="preserve"> (</w:t>
@@ -432,7 +576,15 @@
         <w:t>the sub-key tha</w:t>
       </w:r>
       <w:r>
-        <w:t>t contains “FilterFullPath” is</w:t>
+        <w:t>t contains “</w:t>
+      </w:r>
+      <w:proofErr w:type="spellStart"/>
+      <w:r>
+        <w:t>FilterFullPath</w:t>
+      </w:r>
+      <w:proofErr w:type="spellEnd"/>
+      <w:r>
+        <w:t>” is</w:t>
       </w:r>
       <w:r>
         <w:t xml:space="preserve"> the</w:t>
@@ -446,7 +598,7 @@
     </w:p>
     <w:p>
       <w:pPr>
-        <w:pStyle w:val="ListParagraph"/>
+        <w:pStyle w:val="a3"/>
         <w:numPr>
           <w:ilvl w:val="1"/>
           <w:numId w:val="3"/>
@@ -455,11 +607,19 @@
           <w:b/>
         </w:rPr>
       </w:pPr>
-      <w:r>
-        <w:rPr>
-          <w:u w:val="single"/>
-        </w:rPr>
-        <w:t xml:space="preserve">VxKex_XXXXXXXX </w:t>
+      <w:proofErr w:type="spellStart"/>
+      <w:r>
+        <w:rPr>
+          <w:u w:val="single"/>
+        </w:rPr>
+        <w:t>VxKex_XXXXXXXX</w:t>
+      </w:r>
+      <w:proofErr w:type="spellEnd"/>
+      <w:r>
+        <w:rPr>
+          <w:u w:val="single"/>
+        </w:rPr>
+        <w:t xml:space="preserve"> </w:t>
       </w:r>
       <w:r>
         <w:t>(</w:t>
@@ -489,12 +649,20 @@
         <w:br/>
       </w:r>
       <w:r>
-        <w:t>The XXXXXXXX represents an 8-digit random hexadecimal identifier which is automatically generated by the configuration library in order to avoid naming conflicts. The exact name of this key is not significant to Windows, but the key should begin with “VxKex_” so that the configuration library can recognize it.</w:t>
-      </w:r>
-    </w:p>
-    <w:p>
-      <w:pPr>
-        <w:pStyle w:val="ListParagraph"/>
+        <w:t>The XXXXXXXX represents an 8-digit random hexadecimal identifier which is automatically generated by the configuration library in order to avoid naming conflicts. The exact name of this key is not significant to Windows, but the key should begin with “</w:t>
+      </w:r>
+      <w:proofErr w:type="spellStart"/>
+      <w:r>
+        <w:t>VxKex</w:t>
+      </w:r>
+      <w:proofErr w:type="spellEnd"/>
+      <w:r>
+        <w:t>_” so that the configuration library can recognize it.</w:t>
+      </w:r>
+    </w:p>
+    <w:p>
+      <w:pPr>
+        <w:pStyle w:val="a3"/>
         <w:numPr>
           <w:ilvl w:val="2"/>
           <w:numId w:val="3"/>
@@ -503,11 +671,19 @@
           <w:b/>
         </w:rPr>
       </w:pPr>
-      <w:r>
-        <w:rPr>
-          <w:u w:val="single"/>
-        </w:rPr>
-        <w:t xml:space="preserve">FilterFullPath </w:t>
+      <w:proofErr w:type="spellStart"/>
+      <w:r>
+        <w:rPr>
+          <w:u w:val="single"/>
+        </w:rPr>
+        <w:t>FilterFullPath</w:t>
+      </w:r>
+      <w:proofErr w:type="spellEnd"/>
+      <w:r>
+        <w:rPr>
+          <w:u w:val="single"/>
+        </w:rPr>
+        <w:t xml:space="preserve"> </w:t>
       </w:r>
       <w:r>
         <w:t>(</w:t>
@@ -523,12 +699,20 @@
       </w:r>
       <w:r>
         <w:br/>
-        <w:t>See the comment for UseFilter.</w:t>
-      </w:r>
-    </w:p>
-    <w:p>
-      <w:pPr>
-        <w:pStyle w:val="ListParagraph"/>
+        <w:t xml:space="preserve">See the comment for </w:t>
+      </w:r>
+      <w:proofErr w:type="spellStart"/>
+      <w:r>
+        <w:t>UseFilter</w:t>
+      </w:r>
+      <w:proofErr w:type="spellEnd"/>
+      <w:r>
+        <w:t>.</w:t>
+      </w:r>
+    </w:p>
+    <w:p>
+      <w:pPr>
+        <w:pStyle w:val="a3"/>
         <w:numPr>
           <w:ilvl w:val="2"/>
           <w:numId w:val="3"/>
@@ -537,11 +721,19 @@
           <w:b/>
         </w:rPr>
       </w:pPr>
-      <w:r>
-        <w:rPr>
-          <w:u w:val="single"/>
-        </w:rPr>
-        <w:t xml:space="preserve">GlobalFlag </w:t>
+      <w:proofErr w:type="spellStart"/>
+      <w:r>
+        <w:rPr>
+          <w:u w:val="single"/>
+        </w:rPr>
+        <w:t>GlobalFlag</w:t>
+      </w:r>
+      <w:proofErr w:type="spellEnd"/>
+      <w:r>
+        <w:rPr>
+          <w:u w:val="single"/>
+        </w:rPr>
+        <w:t xml:space="preserve"> </w:t>
       </w:r>
       <w:r>
         <w:t>(</w:t>
@@ -562,12 +754,20 @@
         <w:t>The configurator sets/clears FLG_APPLICATION_VERIFIER in order to enable or</w:t>
       </w:r>
       <w:r>
-        <w:t xml:space="preserve"> disable VxKex.</w:t>
-      </w:r>
-    </w:p>
-    <w:p>
-      <w:pPr>
-        <w:pStyle w:val="ListParagraph"/>
+        <w:t xml:space="preserve"> disable </w:t>
+      </w:r>
+      <w:proofErr w:type="spellStart"/>
+      <w:r>
+        <w:t>VxKex</w:t>
+      </w:r>
+      <w:proofErr w:type="spellEnd"/>
+      <w:r>
+        <w:t>.</w:t>
+      </w:r>
+    </w:p>
+    <w:p>
+      <w:pPr>
+        <w:pStyle w:val="a3"/>
         <w:numPr>
           <w:ilvl w:val="2"/>
           <w:numId w:val="3"/>
@@ -576,12 +776,14 @@
           <w:b/>
         </w:rPr>
       </w:pPr>
+      <w:proofErr w:type="spellStart"/>
       <w:r>
         <w:rPr>
           <w:u w:val="single"/>
         </w:rPr>
         <w:t>VerifierFlags</w:t>
       </w:r>
+      <w:proofErr w:type="spellEnd"/>
       <w:r>
         <w:t xml:space="preserve"> (</w:t>
       </w:r>
@@ -596,12 +798,20 @@
       </w:r>
       <w:r>
         <w:br/>
-        <w:t>The configurator sets this to 0x80000000 when enabling VxKex in order to disable page heap.</w:t>
-      </w:r>
-    </w:p>
-    <w:p>
-      <w:pPr>
-        <w:pStyle w:val="ListParagraph"/>
+        <w:t xml:space="preserve">The configurator sets this to 0x80000000 when enabling </w:t>
+      </w:r>
+      <w:proofErr w:type="spellStart"/>
+      <w:r>
+        <w:t>VxKex</w:t>
+      </w:r>
+      <w:proofErr w:type="spellEnd"/>
+      <w:r>
+        <w:t xml:space="preserve"> in order to disable page heap.</w:t>
+      </w:r>
+    </w:p>
+    <w:p>
+      <w:pPr>
+        <w:pStyle w:val="a3"/>
         <w:numPr>
           <w:ilvl w:val="2"/>
           <w:numId w:val="3"/>
@@ -610,6 +820,7 @@
           <w:b/>
         </w:rPr>
       </w:pPr>
+      <w:proofErr w:type="spellStart"/>
       <w:r>
         <w:rPr>
           <w:u w:val="single"/>
@@ -617,6 +828,7 @@
         <w:lastRenderedPageBreak/>
         <w:t>VerifierDlls</w:t>
       </w:r>
+      <w:proofErr w:type="spellEnd"/>
       <w:r>
         <w:t xml:space="preserve"> (</w:t>
       </w:r>
@@ -633,12 +845,20 @@
         <w:br/>
       </w:r>
       <w:r>
-        <w:t>Space separated list of DLLs to load as verifier providers. The configurator adds/removes "KexDll.dll" from this list to enable or disable VxKex for a particular program.</w:t>
-      </w:r>
-    </w:p>
-    <w:p>
-      <w:pPr>
-        <w:pStyle w:val="ListParagraph"/>
+        <w:t xml:space="preserve">Space separated list of DLLs to load as verifier providers. The configurator adds/removes "KexDll.dll" from this list to enable or disable </w:t>
+      </w:r>
+      <w:proofErr w:type="spellStart"/>
+      <w:r>
+        <w:t>VxKex</w:t>
+      </w:r>
+      <w:proofErr w:type="spellEnd"/>
+      <w:r>
+        <w:t xml:space="preserve"> for a particular program.</w:t>
+      </w:r>
+    </w:p>
+    <w:p>
+      <w:pPr>
+        <w:pStyle w:val="a3"/>
         <w:numPr>
           <w:ilvl w:val="2"/>
           <w:numId w:val="3"/>
@@ -647,12 +867,14 @@
           <w:b/>
         </w:rPr>
       </w:pPr>
+      <w:proofErr w:type="spellStart"/>
       <w:r>
         <w:rPr>
           <w:u w:val="single"/>
         </w:rPr>
         <w:t>KEX_DisableForChild</w:t>
       </w:r>
+      <w:proofErr w:type="spellEnd"/>
       <w:r>
         <w:t xml:space="preserve"> (</w:t>
       </w:r>
@@ -669,12 +891,36 @@
         <w:br/>
       </w:r>
       <w:r>
-        <w:t>Normally, VxKex propagates to child processes (propagte.c). If this value is present and non-zero, VxKex will not propagate to child processes.</w:t>
-      </w:r>
-    </w:p>
-    <w:p>
-      <w:pPr>
-        <w:pStyle w:val="ListParagraph"/>
+        <w:t xml:space="preserve">Normally, </w:t>
+      </w:r>
+      <w:proofErr w:type="spellStart"/>
+      <w:r>
+        <w:t>VxKex</w:t>
+      </w:r>
+      <w:proofErr w:type="spellEnd"/>
+      <w:r>
+        <w:t xml:space="preserve"> propagates to child processes (</w:t>
+      </w:r>
+      <w:proofErr w:type="spellStart"/>
+      <w:r>
+        <w:t>propagte.c</w:t>
+      </w:r>
+      <w:proofErr w:type="spellEnd"/>
+      <w:r>
+        <w:t xml:space="preserve">). If this value is present and non-zero, </w:t>
+      </w:r>
+      <w:proofErr w:type="spellStart"/>
+      <w:r>
+        <w:t>VxKex</w:t>
+      </w:r>
+      <w:proofErr w:type="spellEnd"/>
+      <w:r>
+        <w:t xml:space="preserve"> will not propagate to child processes.</w:t>
+      </w:r>
+    </w:p>
+    <w:p>
+      <w:pPr>
+        <w:pStyle w:val="a3"/>
         <w:numPr>
           <w:ilvl w:val="2"/>
           <w:numId w:val="3"/>
@@ -683,11 +929,19 @@
           <w:b/>
         </w:rPr>
       </w:pPr>
-      <w:r>
-        <w:rPr>
-          <w:u w:val="single"/>
-        </w:rPr>
-        <w:t xml:space="preserve">KEX_DisableAppSpecific </w:t>
+      <w:proofErr w:type="spellStart"/>
+      <w:r>
+        <w:rPr>
+          <w:u w:val="single"/>
+        </w:rPr>
+        <w:t>KEX_DisableAppSpecific</w:t>
+      </w:r>
+      <w:proofErr w:type="spellEnd"/>
+      <w:r>
+        <w:rPr>
+          <w:u w:val="single"/>
+        </w:rPr>
+        <w:t xml:space="preserve"> </w:t>
       </w:r>
       <w:r>
         <w:t>(</w:t>
@@ -704,23 +958,44 @@
       <w:r>
         <w:br/>
       </w:r>
-      <w:r>
-        <w:t>VxKex may use app-specific hacks or patches to get certain applications to run. If this value is present and non-zero, VxKex will not use app-specific hacks or patches.</w:t>
-      </w:r>
-    </w:p>
-    <w:p>
-      <w:pPr>
-        <w:pStyle w:val="ListParagraph"/>
+      <w:proofErr w:type="spellStart"/>
+      <w:r>
+        <w:t>VxKex</w:t>
+      </w:r>
+      <w:proofErr w:type="spellEnd"/>
+      <w:r>
+        <w:t xml:space="preserve"> may use app-specific hacks or patches to get certain applications to run. If this value is present and non-zero, </w:t>
+      </w:r>
+      <w:proofErr w:type="spellStart"/>
+      <w:r>
+        <w:t>VxKex</w:t>
+      </w:r>
+      <w:proofErr w:type="spellEnd"/>
+      <w:r>
+        <w:t xml:space="preserve"> will not use app-specific hacks or patches.</w:t>
+      </w:r>
+    </w:p>
+    <w:p>
+      <w:pPr>
+        <w:pStyle w:val="a3"/>
         <w:numPr>
           <w:ilvl w:val="2"/>
           <w:numId w:val="3"/>
         </w:numPr>
       </w:pPr>
-      <w:r>
-        <w:rPr>
-          <w:u w:val="single"/>
-        </w:rPr>
-        <w:t xml:space="preserve">KEX_WinVerSpoof </w:t>
+      <w:proofErr w:type="spellStart"/>
+      <w:r>
+        <w:rPr>
+          <w:u w:val="single"/>
+        </w:rPr>
+        <w:t>KEX_WinVerSpoof</w:t>
+      </w:r>
+      <w:proofErr w:type="spellEnd"/>
+      <w:r>
+        <w:rPr>
+          <w:u w:val="single"/>
+        </w:rPr>
+        <w:t xml:space="preserve"> </w:t>
       </w:r>
       <w:r>
         <w:t>(</w:t>
@@ -743,7 +1018,7 @@
     </w:p>
     <w:p>
       <w:pPr>
-        <w:pStyle w:val="ListParagraph"/>
+        <w:pStyle w:val="a3"/>
         <w:ind w:left="2160"/>
       </w:pPr>
       <w:r>
@@ -752,17 +1027,25 @@
     </w:p>
     <w:p>
       <w:pPr>
-        <w:pStyle w:val="ListParagraph"/>
+        <w:pStyle w:val="a3"/>
         <w:numPr>
           <w:ilvl w:val="2"/>
           <w:numId w:val="3"/>
         </w:numPr>
       </w:pPr>
-      <w:r>
-        <w:rPr>
-          <w:u w:val="single"/>
-        </w:rPr>
-        <w:t xml:space="preserve">KEX_StrongVersionSpoof </w:t>
+      <w:proofErr w:type="spellStart"/>
+      <w:r>
+        <w:rPr>
+          <w:u w:val="single"/>
+        </w:rPr>
+        <w:t>KEX_StrongVersionSpoof</w:t>
+      </w:r>
+      <w:proofErr w:type="spellEnd"/>
+      <w:r>
+        <w:rPr>
+          <w:u w:val="single"/>
+        </w:rPr>
+        <w:t xml:space="preserve"> </w:t>
       </w:r>
       <w:r>
         <w:t>(</w:t>
@@ -785,14 +1068,324 @@
     </w:p>
     <w:p>
       <w:pPr>
-        <w:pStyle w:val="ListParagraph"/>
+        <w:pStyle w:val="a3"/>
         <w:ind w:left="2160"/>
-        <w:rPr>
-          <w:b/>
-        </w:rPr>
-      </w:pPr>
-      <w:r>
-        <w:t>See the KEX_STRONGSPOOF_* definitions and verspoof.c for more information.</w:t>
+      </w:pPr>
+      <w:r>
+        <w:t xml:space="preserve">See the KEX_STRONGSPOOF_* definitions and </w:t>
+      </w:r>
+      <w:proofErr w:type="spellStart"/>
+      <w:r>
+        <w:t>verspoof.c</w:t>
+      </w:r>
+      <w:proofErr w:type="spellEnd"/>
+      <w:r>
+        <w:t xml:space="preserve"> for more information.</w:t>
+      </w:r>
+    </w:p>
+    <w:p>
+      <w:pPr>
+        <w:pStyle w:val="a3"/>
+        <w:numPr>
+          <w:ilvl w:val="2"/>
+          <w:numId w:val="5"/>
+        </w:numPr>
+      </w:pPr>
+      <w:proofErr w:type="spellStart"/>
+      <w:r>
+        <w:rPr>
+          <w:u w:val="single"/>
+        </w:rPr>
+        <w:t>KEX_TlsForceEnabledProtocols</w:t>
+      </w:r>
+      <w:proofErr w:type="spellEnd"/>
+      <w:r>
+        <w:t xml:space="preserve"> (</w:t>
+      </w:r>
+      <w:r>
+        <w:rPr>
+          <w:i/>
+        </w:rPr>
+        <w:t>REG_DWORD</w:t>
+      </w:r>
+      <w:r>
+        <w:t>)</w:t>
+      </w:r>
+      <w:r>
+        <w:br/>
+        <w:t xml:space="preserve">Forcibly enables TLS protocol versions in </w:t>
+      </w:r>
+      <w:proofErr w:type="spellStart"/>
+      <w:r>
+        <w:t>KxSChanl</w:t>
+      </w:r>
+      <w:proofErr w:type="spellEnd"/>
+      <w:r>
+        <w:t>. This is a bitmask of SP_PROT_* values.</w:t>
+      </w:r>
+    </w:p>
+    <w:p>
+      <w:pPr>
+        <w:pStyle w:val="a3"/>
+        <w:numPr>
+          <w:ilvl w:val="2"/>
+          <w:numId w:val="5"/>
+        </w:numPr>
+      </w:pPr>
+      <w:proofErr w:type="spellStart"/>
+      <w:r>
+        <w:rPr>
+          <w:u w:val="single"/>
+        </w:rPr>
+        <w:t>KEX_TlsForceDisabledProtocols</w:t>
+      </w:r>
+      <w:proofErr w:type="spellEnd"/>
+      <w:r>
+        <w:t xml:space="preserve"> (</w:t>
+      </w:r>
+      <w:r>
+        <w:rPr>
+          <w:i/>
+        </w:rPr>
+        <w:t>REG_DWORD</w:t>
+      </w:r>
+      <w:r>
+        <w:t>)</w:t>
+      </w:r>
+      <w:r>
+        <w:br/>
+        <w:t xml:space="preserve">Forcibly disables TLS protocol versions in </w:t>
+      </w:r>
+      <w:proofErr w:type="spellStart"/>
+      <w:r>
+        <w:t>KxSChanl</w:t>
+      </w:r>
+      <w:proofErr w:type="spellEnd"/>
+      <w:r>
+        <w:t>. This is a bitmask of SP_PROT_* values.</w:t>
+      </w:r>
+      <w:r>
+        <w:br/>
+        <w:t xml:space="preserve">If bits in </w:t>
+      </w:r>
+      <w:proofErr w:type="spellStart"/>
+      <w:r>
+        <w:t>TlsForceDisabledProtocols</w:t>
+      </w:r>
+      <w:proofErr w:type="spellEnd"/>
+      <w:r>
+        <w:t xml:space="preserve"> conflict with bits set in </w:t>
+      </w:r>
+      <w:proofErr w:type="spellStart"/>
+      <w:r>
+        <w:t>TlsForceEnabledProtocols</w:t>
+      </w:r>
+      <w:proofErr w:type="spellEnd"/>
+      <w:r>
+        <w:t>, the force-disabled protocols will have priority.</w:t>
+      </w:r>
+      <w:r>
+        <w:br/>
+        <w:t xml:space="preserve">If all </w:t>
+      </w:r>
+      <w:proofErr w:type="spellStart"/>
+      <w:r>
+        <w:t>KxSchanl</w:t>
+      </w:r>
+      <w:proofErr w:type="spellEnd"/>
+      <w:r>
+        <w:t xml:space="preserve">-supported protocols are forcibly disabled, </w:t>
+      </w:r>
+      <w:proofErr w:type="spellStart"/>
+      <w:r>
+        <w:t>KxSChanl</w:t>
+      </w:r>
+      <w:proofErr w:type="spellEnd"/>
+      <w:r>
+        <w:t xml:space="preserve"> will be disabled, and the system </w:t>
+      </w:r>
+      <w:proofErr w:type="spellStart"/>
+      <w:r>
+        <w:t>Schannel</w:t>
+      </w:r>
+      <w:proofErr w:type="spellEnd"/>
+      <w:r>
+        <w:t xml:space="preserve"> will be used instead. In order to deliberately achieve this effect, set </w:t>
+      </w:r>
+      <w:proofErr w:type="spellStart"/>
+      <w:r>
+        <w:t>KEX_TlsForceDisabledProtocols</w:t>
+      </w:r>
+      <w:proofErr w:type="spellEnd"/>
+      <w:r>
+        <w:t xml:space="preserve"> to 0xFFFFFFFF.</w:t>
+      </w:r>
+    </w:p>
+    <w:p>
+      <w:pPr>
+        <w:pStyle w:val="a3"/>
+        <w:numPr>
+          <w:ilvl w:val="2"/>
+          <w:numId w:val="5"/>
+        </w:numPr>
+      </w:pPr>
+      <w:proofErr w:type="spellStart"/>
+      <w:r>
+        <w:rPr>
+          <w:u w:val="single"/>
+        </w:rPr>
+        <w:t>KEX_DllRewriteEntries</w:t>
+      </w:r>
+      <w:proofErr w:type="spellEnd"/>
+      <w:r>
+        <w:t xml:space="preserve"> (</w:t>
+      </w:r>
+      <w:r>
+        <w:rPr>
+          <w:i/>
+        </w:rPr>
+        <w:t>REG_SZ</w:t>
+      </w:r>
+      <w:r>
+        <w:t>)</w:t>
+      </w:r>
+      <w:r>
+        <w:br/>
+        <w:t>A bar-separated list of key-value pairs, where keys and values are separated by colons. Entries in this list will update the DLL rewrite mapper before any imports are loaded. A key-value pair where the value is empty will cause the DLL rewrite entry in question to be deleted.</w:t>
+      </w:r>
+      <w:r>
+        <w:br/>
+        <w:t xml:space="preserve">Example:  </w:t>
+      </w:r>
+      <w:r>
+        <w:rPr>
+          <w:rFonts w:ascii="Consolas" w:hAnsi="Consolas" w:cs="Consolas"/>
+          <w:sz w:val="18"/>
+          <w:szCs w:val="18"/>
+          <w:highlight w:val="green"/>
+        </w:rPr>
+        <w:t>d3d12:dxvk|dxgi:|xinput1_5:xinput1_3</w:t>
+      </w:r>
+      <w:r>
+        <w:t xml:space="preserve">  (DXGI.dll would be removed from the rewrite list).</w:t>
+      </w:r>
+      <w:r>
+        <w:br/>
+        <w:t>None of the DLL names specified should have a .</w:t>
+      </w:r>
+      <w:proofErr w:type="spellStart"/>
+      <w:r>
+        <w:t>dll</w:t>
+      </w:r>
+      <w:proofErr w:type="spellEnd"/>
+      <w:r>
+        <w:t xml:space="preserve"> extension.</w:t>
+      </w:r>
+      <w:r>
+        <w:br/>
+        <w:t xml:space="preserve">All of the rewritten DLL names specified </w:t>
+      </w:r>
+      <w:r>
+        <w:rPr>
+          <w:b/>
+        </w:rPr>
+        <w:t>must be shorter or same length</w:t>
+      </w:r>
+      <w:r>
+        <w:t xml:space="preserve"> compared to the original names.</w:t>
+      </w:r>
+      <w:r>
+        <w:br/>
+        <w:t>The total length of the registry value string must not exceed 259 characters.</w:t>
+      </w:r>
+    </w:p>
+    <w:p>
+      <w:pPr>
+        <w:pStyle w:val="a3"/>
+        <w:numPr>
+          <w:ilvl w:val="2"/>
+          <w:numId w:val="5"/>
+        </w:numPr>
+      </w:pPr>
+      <w:proofErr w:type="spellStart"/>
+      <w:r>
+        <w:rPr>
+          <w:u w:val="single"/>
+        </w:rPr>
+        <w:t>KEX_DllRewriteExemptions</w:t>
+      </w:r>
+      <w:proofErr w:type="spellEnd"/>
+      <w:r>
+        <w:t xml:space="preserve"> (</w:t>
+      </w:r>
+      <w:r>
+        <w:rPr>
+          <w:i/>
+        </w:rPr>
+        <w:t>REG_SZ</w:t>
+      </w:r>
+      <w:r>
+        <w:t>)</w:t>
+      </w:r>
+      <w:r>
+        <w:br/>
+        <w:t>A bar-separated list of DLL names which will not have their import tables rewritten.</w:t>
+      </w:r>
+      <w:r>
+        <w:br/>
+        <w:t xml:space="preserve">Example: </w:t>
+      </w:r>
+      <w:r>
+        <w:rPr>
+          <w:rFonts w:ascii="Consolas" w:hAnsi="Consolas" w:cs="Consolas"/>
+          <w:sz w:val="18"/>
+          <w:szCs w:val="18"/>
+          <w:highlight w:val="green"/>
+        </w:rPr>
+        <w:t>steam_api64.dll|MacType64.Core.dll|RTSSHooks64.dll</w:t>
+      </w:r>
+      <w:r>
+        <w:br/>
+        <w:t xml:space="preserve">Unlike </w:t>
+      </w:r>
+      <w:proofErr w:type="spellStart"/>
+      <w:r>
+        <w:t>KEX_DllRewriteEntries</w:t>
+      </w:r>
+      <w:proofErr w:type="spellEnd"/>
+      <w:r>
+        <w:t xml:space="preserve">, all DLL names specified </w:t>
+      </w:r>
+      <w:r>
+        <w:rPr>
+          <w:b/>
+        </w:rPr>
+        <w:t>should</w:t>
+      </w:r>
+      <w:r>
+        <w:t xml:space="preserve"> have a file extension (e.g. .</w:t>
+      </w:r>
+      <w:proofErr w:type="spellStart"/>
+      <w:r>
+        <w:t>dll</w:t>
+      </w:r>
+      <w:proofErr w:type="spellEnd"/>
+      <w:proofErr w:type="gramStart"/>
+      <w:r>
+        <w:t>, .</w:t>
+      </w:r>
+      <w:proofErr w:type="spellStart"/>
+      <w:r>
+        <w:t>pyd</w:t>
+      </w:r>
+      <w:proofErr w:type="spellEnd"/>
+      <w:proofErr w:type="gramEnd"/>
+      <w:r>
+        <w:t>).</w:t>
+      </w:r>
+      <w:r>
+        <w:br/>
+        <w:t>The total length of the registry value string must not exceed 259 characters.</w:t>
       </w:r>
       <w:bookmarkStart w:id="0" w:name="_GoBack"/>
       <w:bookmarkEnd w:id="0"/>
@@ -830,7 +1423,7 @@
     </w:p>
     <w:p>
       <w:pPr>
-        <w:pStyle w:val="ListParagraph"/>
+        <w:pStyle w:val="a3"/>
         <w:numPr>
           <w:ilvl w:val="0"/>
           <w:numId w:val="3"/>
@@ -866,7 +1459,7 @@
     </w:p>
     <w:p>
       <w:pPr>
-        <w:pStyle w:val="ListParagraph"/>
+        <w:pStyle w:val="a3"/>
         <w:numPr>
           <w:ilvl w:val="1"/>
           <w:numId w:val="3"/>
@@ -908,12 +1501,20 @@
       </w:r>
       <w:r>
         <w:br/>
-        <w:t>Always equal to &lt;KexDir&gt;\KexShlEx.dll.</w:t>
-      </w:r>
-    </w:p>
-    <w:p>
-      <w:pPr>
-        <w:pStyle w:val="ListParagraph"/>
+        <w:t>Always equal to &lt;</w:t>
+      </w:r>
+      <w:proofErr w:type="spellStart"/>
+      <w:r>
+        <w:t>KexDir</w:t>
+      </w:r>
+      <w:proofErr w:type="spellEnd"/>
+      <w:r>
+        <w:t>&gt;\KexShlEx.dll.</w:t>
+      </w:r>
+    </w:p>
+    <w:p>
+      <w:pPr>
+        <w:pStyle w:val="a3"/>
         <w:numPr>
           <w:ilvl w:val="1"/>
           <w:numId w:val="3"/>
@@ -922,12 +1523,14 @@
           <w:u w:val="single"/>
         </w:rPr>
       </w:pPr>
+      <w:proofErr w:type="spellStart"/>
       <w:r>
         <w:rPr>
           <w:u w:val="single"/>
         </w:rPr>
         <w:t>ThreadingModel</w:t>
       </w:r>
+      <w:proofErr w:type="spellEnd"/>
       <w:r>
         <w:t xml:space="preserve"> (</w:t>
       </w:r>
@@ -961,12 +1564,68 @@
         <w:rPr>
           <w:b/>
         </w:rPr>
-        <w:t>HKEY_CLASSES_ROOT\exefile\shellex\PropertySheetHandlers\KexShlEx Property Page (•)</w:t>
-      </w:r>
-    </w:p>
-    <w:p>
-      <w:pPr>
-        <w:pStyle w:val="ListParagraph"/>
+        <w:t>HKEY_CLASSES_ROOT\</w:t>
+      </w:r>
+      <w:proofErr w:type="spellStart"/>
+      <w:r>
+        <w:rPr>
+          <w:b/>
+        </w:rPr>
+        <w:t>exefile</w:t>
+      </w:r>
+      <w:proofErr w:type="spellEnd"/>
+      <w:r>
+        <w:rPr>
+          <w:b/>
+        </w:rPr>
+        <w:t>\</w:t>
+      </w:r>
+      <w:proofErr w:type="spellStart"/>
+      <w:r>
+        <w:rPr>
+          <w:b/>
+        </w:rPr>
+        <w:t>shellex</w:t>
+      </w:r>
+      <w:proofErr w:type="spellEnd"/>
+      <w:r>
+        <w:rPr>
+          <w:b/>
+        </w:rPr>
+        <w:t>\</w:t>
+      </w:r>
+      <w:proofErr w:type="spellStart"/>
+      <w:r>
+        <w:rPr>
+          <w:b/>
+        </w:rPr>
+        <w:t>PropertySheetHandlers</w:t>
+      </w:r>
+      <w:proofErr w:type="spellEnd"/>
+      <w:r>
+        <w:rPr>
+          <w:b/>
+        </w:rPr>
+        <w:t>\</w:t>
+      </w:r>
+      <w:proofErr w:type="spellStart"/>
+      <w:r>
+        <w:rPr>
+          <w:b/>
+        </w:rPr>
+        <w:t>KexShlEx</w:t>
+      </w:r>
+      <w:proofErr w:type="spellEnd"/>
+      <w:r>
+        <w:rPr>
+          <w:b/>
+        </w:rPr>
+        <w:t xml:space="preserve"> Property Page (•)</w:t>
+      </w:r>
+    </w:p>
+    <w:p>
+      <w:pPr>
+        <w:pStyle w:val="a3"/>
         <w:numPr>
           <w:ilvl w:val="0"/>
           <w:numId w:val="3"/>
@@ -976,6 +1635,7 @@
         <w:rPr>
           <w:u w:val="single"/>
         </w:rPr>
+        <w:lastRenderedPageBreak/>
         <w:t>(</w:t>
       </w:r>
       <w:r>
@@ -1008,10 +1668,18 @@
         <w:t>Always equal to “{</w:t>
       </w:r>
       <w:r>
-        <w:t xml:space="preserve">9AACA888-A5F5-4C01-852E-8A2005C1D45F </w:t>
-      </w:r>
-      <w:r>
-        <w:t>}”.</w:t>
+        <w:t>9AACA888-A5F5-4C01-852E-8A2005C1D45</w:t>
+      </w:r>
+      <w:proofErr w:type="gramStart"/>
+      <w:r>
+        <w:t xml:space="preserve">F </w:t>
+      </w:r>
+      <w:r>
+        <w:t>}</w:t>
+      </w:r>
+      <w:proofErr w:type="gramEnd"/>
+      <w:r>
+        <w:t>”.</w:t>
       </w:r>
     </w:p>
     <w:sectPr>
@@ -1025,8 +1693,8 @@
 </file>
 
 <file path=word/numbering.xml><?xml version="1.0" encoding="utf-8"?>
-<w:numbering xmlns:wpc="http://schemas.microsoft.com/office/word/2010/wordprocessingCanvas" xmlns:mc="http://schemas.openxmlformats.org/markup-compatibility/2006" xmlns:o="urn:schemas-microsoft-com:office:office" xmlns:r="http://schemas.openxmlformats.org/officeDocument/2006/relationships" xmlns:m="http://schemas.openxmlformats.org/officeDocument/2006/math" xmlns:v="urn:schemas-microsoft-com:vml" xmlns:wp14="http://schemas.microsoft.com/office/word/2010/wordprocessingDrawing" xmlns:wp="http://schemas.openxmlformats.org/drawingml/2006/wordprocessingDrawing" xmlns:w10="urn:schemas-microsoft-com:office:word" xmlns:w="http://schemas.openxmlformats.org/wordprocessingml/2006/main" xmlns:w14="http://schemas.microsoft.com/office/word/2010/wordml" xmlns:wpg="http://schemas.microsoft.com/office/word/2010/wordprocessingGroup" xmlns:wpi="http://schemas.microsoft.com/office/word/2010/wordprocessingInk" xmlns:wne="http://schemas.microsoft.com/office/word/2006/wordml" xmlns:wps="http://schemas.microsoft.com/office/word/2010/wordprocessingShape" mc:Ignorable="w14 wp14">
-  <w:abstractNum w:abstractNumId="0">
+<w:numbering xmlns:wpc="http://schemas.microsoft.com/office/word/2010/wordprocessingCanvas" xmlns:cx="http://schemas.microsoft.com/office/drawing/2014/chartex" xmlns:cx1="http://schemas.microsoft.com/office/drawing/2015/9/8/chartex" xmlns:cx2="http://schemas.microsoft.com/office/drawing/2015/10/21/chartex" xmlns:cx3="http://schemas.microsoft.com/office/drawing/2016/5/9/chartex" xmlns:cx4="http://schemas.microsoft.com/office/drawing/2016/5/10/chartex" xmlns:cx5="http://schemas.microsoft.com/office/drawing/2016/5/11/chartex" xmlns:cx6="http://schemas.microsoft.com/office/drawing/2016/5/12/chartex" xmlns:cx7="http://schemas.microsoft.com/office/drawing/2016/5/13/chartex" xmlns:cx8="http://schemas.microsoft.com/office/drawing/2016/5/14/chartex" xmlns:mc="http://schemas.openxmlformats.org/markup-compatibility/2006" xmlns:aink="http://schemas.microsoft.com/office/drawing/2016/ink" xmlns:am3d="http://schemas.microsoft.com/office/drawing/2017/model3d" xmlns:o="urn:schemas-microsoft-com:office:office" xmlns:r="http://schemas.openxmlformats.org/officeDocument/2006/relationships" xmlns:m="http://schemas.openxmlformats.org/officeDocument/2006/math" xmlns:v="urn:schemas-microsoft-com:vml" xmlns:wp14="http://schemas.microsoft.com/office/word/2010/wordprocessingDrawing" xmlns:wp="http://schemas.openxmlformats.org/drawingml/2006/wordprocessingDrawing" xmlns:w10="urn:schemas-microsoft-com:office:word" xmlns:w="http://schemas.openxmlformats.org/wordprocessingml/2006/main" xmlns:w14="http://schemas.microsoft.com/office/word/2010/wordml" xmlns:w15="http://schemas.microsoft.com/office/word/2012/wordml" xmlns:w16cid="http://schemas.microsoft.com/office/word/2016/wordml/cid" xmlns:w16se="http://schemas.microsoft.com/office/word/2015/wordml/symex" xmlns:wpg="http://schemas.microsoft.com/office/word/2010/wordprocessingGroup" xmlns:wpi="http://schemas.microsoft.com/office/word/2010/wordprocessingInk" xmlns:wne="http://schemas.microsoft.com/office/word/2006/wordml" xmlns:wps="http://schemas.microsoft.com/office/word/2010/wordprocessingShape" mc:Ignorable="w14 w15 w16se w16cid wp14">
+  <w:abstractNum w:abstractNumId="0" w15:restartNumberingAfterBreak="0">
     <w:nsid w:val="2BFF1D1D"/>
     <w:multiLevelType w:val="hybridMultilevel"/>
     <w:tmpl w:val="979E36CA"/>
@@ -1139,7 +1807,7 @@
       </w:rPr>
     </w:lvl>
   </w:abstractNum>
-  <w:abstractNum w:abstractNumId="1">
+  <w:abstractNum w:abstractNumId="1" w15:restartNumberingAfterBreak="0">
     <w:nsid w:val="57DC63E5"/>
     <w:multiLevelType w:val="multilevel"/>
     <w:tmpl w:val="979E36CA"/>
@@ -1252,7 +1920,7 @@
       </w:rPr>
     </w:lvl>
   </w:abstractNum>
-  <w:abstractNum w:abstractNumId="2">
+  <w:abstractNum w:abstractNumId="2" w15:restartNumberingAfterBreak="0">
     <w:nsid w:val="5A355998"/>
     <w:multiLevelType w:val="hybridMultilevel"/>
     <w:tmpl w:val="CA20B062"/>
@@ -1365,7 +2033,7 @@
       </w:rPr>
     </w:lvl>
   </w:abstractNum>
-  <w:abstractNum w:abstractNumId="3">
+  <w:abstractNum w:abstractNumId="3" w15:restartNumberingAfterBreak="0">
     <w:nsid w:val="7E280750"/>
     <w:multiLevelType w:val="hybridMultilevel"/>
     <w:tmpl w:val="8CD08E60"/>
@@ -1490,15 +2158,27 @@
   <w:num w:numId="4">
     <w:abstractNumId w:val="1"/>
   </w:num>
+  <w:num w:numId="5">
+    <w:abstractNumId w:val="0"/>
+    <w:lvlOverride w:ilvl="0"/>
+    <w:lvlOverride w:ilvl="1"/>
+    <w:lvlOverride w:ilvl="2"/>
+    <w:lvlOverride w:ilvl="3"/>
+    <w:lvlOverride w:ilvl="4"/>
+    <w:lvlOverride w:ilvl="5"/>
+    <w:lvlOverride w:ilvl="6"/>
+    <w:lvlOverride w:ilvl="7"/>
+    <w:lvlOverride w:ilvl="8"/>
+  </w:num>
 </w:numbering>
 </file>
 
 <file path=word/styles.xml><?xml version="1.0" encoding="utf-8"?>
-<w:styles xmlns:mc="http://schemas.openxmlformats.org/markup-compatibility/2006" xmlns:r="http://schemas.openxmlformats.org/officeDocument/2006/relationships" xmlns:w="http://schemas.openxmlformats.org/wordprocessingml/2006/main" xmlns:w14="http://schemas.microsoft.com/office/word/2010/wordml" mc:Ignorable="w14">
+<w:styles xmlns:mc="http://schemas.openxmlformats.org/markup-compatibility/2006" xmlns:r="http://schemas.openxmlformats.org/officeDocument/2006/relationships" xmlns:w="http://schemas.openxmlformats.org/wordprocessingml/2006/main" xmlns:w14="http://schemas.microsoft.com/office/word/2010/wordml" xmlns:w15="http://schemas.microsoft.com/office/word/2012/wordml" xmlns:w16cid="http://schemas.microsoft.com/office/word/2016/wordml/cid" xmlns:w16se="http://schemas.microsoft.com/office/word/2015/wordml/symex" mc:Ignorable="w14 w15 w16se w16cid">
   <w:docDefaults>
     <w:rPrDefault>
       <w:rPr>
-        <w:rFonts w:asciiTheme="minorHAnsi" w:eastAsiaTheme="minorHAnsi" w:hAnsiTheme="minorHAnsi" w:cstheme="minorBidi"/>
+        <w:rFonts w:asciiTheme="minorHAnsi" w:eastAsiaTheme="minorEastAsia" w:hAnsiTheme="minorHAnsi" w:cstheme="minorBidi"/>
         <w:sz w:val="22"/>
         <w:szCs w:val="22"/>
         <w:lang w:val="en-AU" w:eastAsia="en-US" w:bidi="ar-SA"/>
@@ -1510,154 +2190,393 @@
       </w:pPr>
     </w:pPrDefault>
   </w:docDefaults>
-  <w:latentStyles w:defLockedState="0" w:defUIPriority="99" w:defSemiHidden="1" w:defUnhideWhenUsed="1" w:defQFormat="0" w:count="267">
-    <w:lsdException w:name="Normal" w:semiHidden="0" w:uiPriority="0" w:unhideWhenUsed="0" w:qFormat="1"/>
-    <w:lsdException w:name="heading 1" w:semiHidden="0" w:uiPriority="9" w:unhideWhenUsed="0" w:qFormat="1"/>
-    <w:lsdException w:name="heading 2" w:uiPriority="9" w:qFormat="1"/>
-    <w:lsdException w:name="heading 3" w:uiPriority="9" w:qFormat="1"/>
-    <w:lsdException w:name="heading 4" w:uiPriority="9" w:qFormat="1"/>
-    <w:lsdException w:name="heading 5" w:uiPriority="9" w:qFormat="1"/>
-    <w:lsdException w:name="heading 6" w:uiPriority="9" w:qFormat="1"/>
-    <w:lsdException w:name="heading 7" w:uiPriority="9" w:qFormat="1"/>
-    <w:lsdException w:name="heading 8" w:uiPriority="9" w:qFormat="1"/>
-    <w:lsdException w:name="heading 9" w:uiPriority="9" w:qFormat="1"/>
-    <w:lsdException w:name="toc 1" w:uiPriority="39"/>
-    <w:lsdException w:name="toc 2" w:uiPriority="39"/>
-    <w:lsdException w:name="toc 3" w:uiPriority="39"/>
-    <w:lsdException w:name="toc 4" w:uiPriority="39"/>
-    <w:lsdException w:name="toc 5" w:uiPriority="39"/>
-    <w:lsdException w:name="toc 6" w:uiPriority="39"/>
-    <w:lsdException w:name="toc 7" w:uiPriority="39"/>
-    <w:lsdException w:name="toc 8" w:uiPriority="39"/>
-    <w:lsdException w:name="toc 9" w:uiPriority="39"/>
-    <w:lsdException w:name="caption" w:uiPriority="35" w:qFormat="1"/>
-    <w:lsdException w:name="Title" w:semiHidden="0" w:uiPriority="10" w:unhideWhenUsed="0" w:qFormat="1"/>
-    <w:lsdException w:name="Default Paragraph Font" w:uiPriority="1"/>
-    <w:lsdException w:name="Subtitle" w:semiHidden="0" w:uiPriority="11" w:unhideWhenUsed="0" w:qFormat="1"/>
-    <w:lsdException w:name="Strong" w:semiHidden="0" w:uiPriority="22" w:unhideWhenUsed="0" w:qFormat="1"/>
-    <w:lsdException w:name="Emphasis" w:semiHidden="0" w:uiPriority="20" w:unhideWhenUsed="0" w:qFormat="1"/>
-    <w:lsdException w:name="Table Grid" w:semiHidden="0" w:uiPriority="59" w:unhideWhenUsed="0"/>
-    <w:lsdException w:name="Placeholder Text" w:unhideWhenUsed="0"/>
-    <w:lsdException w:name="No Spacing" w:semiHidden="0" w:uiPriority="1" w:unhideWhenUsed="0" w:qFormat="1"/>
-    <w:lsdException w:name="Light Shading" w:semiHidden="0" w:uiPriority="60" w:unhideWhenUsed="0"/>
-    <w:lsdException w:name="Light List" w:semiHidden="0" w:uiPriority="61" w:unhideWhenUsed="0"/>
-    <w:lsdException w:name="Light Grid" w:semiHidden="0" w:uiPriority="62" w:unhideWhenUsed="0"/>
-    <w:lsdException w:name="Medium Shading 1" w:semiHidden="0" w:uiPriority="63" w:unhideWhenUsed="0"/>
-    <w:lsdException w:name="Medium Shading 2" w:semiHidden="0" w:uiPriority="64" w:unhideWhenUsed="0"/>
-    <w:lsdException w:name="Medium List 1" w:semiHidden="0" w:uiPriority="65" w:unhideWhenUsed="0"/>
-    <w:lsdException w:name="Medium List 2" w:semiHidden="0" w:uiPriority="66" w:unhideWhenUsed="0"/>
-    <w:lsdException w:name="Medium Grid 1" w:semiHidden="0" w:uiPriority="67" w:unhideWhenUsed="0"/>
-    <w:lsdException w:name="Medium Grid 2" w:semiHidden="0" w:uiPriority="68" w:unhideWhenUsed="0"/>
-    <w:lsdException w:name="Medium Grid 3" w:semiHidden="0" w:uiPriority="69" w:unhideWhenUsed="0"/>
-    <w:lsdException w:name="Dark List" w:semiHidden="0" w:uiPriority="70" w:unhideWhenUsed="0"/>
-    <w:lsdException w:name="Colorful Shading" w:semiHidden="0" w:uiPriority="71" w:unhideWhenUsed="0"/>
-    <w:lsdException w:name="Colorful List" w:semiHidden="0" w:uiPriority="72" w:unhideWhenUsed="0"/>
-    <w:lsdException w:name="Colorful Grid" w:semiHidden="0" w:uiPriority="73" w:unhideWhenUsed="0"/>
-    <w:lsdException w:name="Light Shading Accent 1" w:semiHidden="0" w:uiPriority="60" w:unhideWhenUsed="0"/>
-    <w:lsdException w:name="Light List Accent 1" w:semiHidden="0" w:uiPriority="61" w:unhideWhenUsed="0"/>
-    <w:lsdException w:name="Light Grid Accent 1" w:semiHidden="0" w:uiPriority="62" w:unhideWhenUsed="0"/>
-    <w:lsdException w:name="Medium Shading 1 Accent 1" w:semiHidden="0" w:uiPriority="63" w:unhideWhenUsed="0"/>
-    <w:lsdException w:name="Medium Shading 2 Accent 1" w:semiHidden="0" w:uiPriority="64" w:unhideWhenUsed="0"/>
-    <w:lsdException w:name="Medium List 1 Accent 1" w:semiHidden="0" w:uiPriority="65" w:unhideWhenUsed="0"/>
-    <w:lsdException w:name="Revision" w:unhideWhenUsed="0"/>
-    <w:lsdException w:name="List Paragraph" w:semiHidden="0" w:uiPriority="34" w:unhideWhenUsed="0" w:qFormat="1"/>
-    <w:lsdException w:name="Quote" w:semiHidden="0" w:uiPriority="29" w:unhideWhenUsed="0" w:qFormat="1"/>
-    <w:lsdException w:name="Intense Quote" w:semiHidden="0" w:uiPriority="30" w:unhideWhenUsed="0" w:qFormat="1"/>
-    <w:lsdException w:name="Medium List 2 Accent 1" w:semiHidden="0" w:uiPriority="66" w:unhideWhenUsed="0"/>
-    <w:lsdException w:name="Medium Grid 1 Accent 1" w:semiHidden="0" w:uiPriority="67" w:unhideWhenUsed="0"/>
-    <w:lsdException w:name="Medium Grid 2 Accent 1" w:semiHidden="0" w:uiPriority="68" w:unhideWhenUsed="0"/>
-    <w:lsdException w:name="Medium Grid 3 Accent 1" w:semiHidden="0" w:uiPriority="69" w:unhideWhenUsed="0"/>
-    <w:lsdException w:name="Dark List Accent 1" w:semiHidden="0" w:uiPriority="70" w:unhideWhenUsed="0"/>
-    <w:lsdException w:name="Colorful Shading Accent 1" w:semiHidden="0" w:uiPriority="71" w:unhideWhenUsed="0"/>
-    <w:lsdException w:name="Colorful List Accent 1" w:semiHidden="0" w:uiPriority="72" w:unhideWhenUsed="0"/>
-    <w:lsdException w:name="Colorful Grid Accent 1" w:semiHidden="0" w:uiPriority="73" w:unhideWhenUsed="0"/>
-    <w:lsdException w:name="Light Shading Accent 2" w:semiHidden="0" w:uiPriority="60" w:unhideWhenUsed="0"/>
-    <w:lsdException w:name="Light List Accent 2" w:semiHidden="0" w:uiPriority="61" w:unhideWhenUsed="0"/>
-    <w:lsdException w:name="Light Grid Accent 2" w:semiHidden="0" w:uiPriority="62" w:unhideWhenUsed="0"/>
-    <w:lsdException w:name="Medium Shading 1 Accent 2" w:semiHidden="0" w:uiPriority="63" w:unhideWhenUsed="0"/>
-    <w:lsdException w:name="Medium Shading 2 Accent 2" w:semiHidden="0" w:uiPriority="64" w:unhideWhenUsed="0"/>
-    <w:lsdException w:name="Medium List 1 Accent 2" w:semiHidden="0" w:uiPriority="65" w:unhideWhenUsed="0"/>
-    <w:lsdException w:name="Medium List 2 Accent 2" w:semiHidden="0" w:uiPriority="66" w:unhideWhenUsed="0"/>
-    <w:lsdException w:name="Medium Grid 1 Accent 2" w:semiHidden="0" w:uiPriority="67" w:unhideWhenUsed="0"/>
-    <w:lsdException w:name="Medium Grid 2 Accent 2" w:semiHidden="0" w:uiPriority="68" w:unhideWhenUsed="0"/>
-    <w:lsdException w:name="Medium Grid 3 Accent 2" w:semiHidden="0" w:uiPriority="69" w:unhideWhenUsed="0"/>
-    <w:lsdException w:name="Dark List Accent 2" w:semiHidden="0" w:uiPriority="70" w:unhideWhenUsed="0"/>
-    <w:lsdException w:name="Colorful Shading Accent 2" w:semiHidden="0" w:uiPriority="71" w:unhideWhenUsed="0"/>
-    <w:lsdException w:name="Colorful List Accent 2" w:semiHidden="0" w:uiPriority="72" w:unhideWhenUsed="0"/>
-    <w:lsdException w:name="Colorful Grid Accent 2" w:semiHidden="0" w:uiPriority="73" w:unhideWhenUsed="0"/>
-    <w:lsdException w:name="Light Shading Accent 3" w:semiHidden="0" w:uiPriority="60" w:unhideWhenUsed="0"/>
-    <w:lsdException w:name="Light List Accent 3" w:semiHidden="0" w:uiPriority="61" w:unhideWhenUsed="0"/>
-    <w:lsdException w:name="Light Grid Accent 3" w:semiHidden="0" w:uiPriority="62" w:unhideWhenUsed="0"/>
-    <w:lsdException w:name="Medium Shading 1 Accent 3" w:semiHidden="0" w:uiPriority="63" w:unhideWhenUsed="0"/>
-    <w:lsdException w:name="Medium Shading 2 Accent 3" w:semiHidden="0" w:uiPriority="64" w:unhideWhenUsed="0"/>
-    <w:lsdException w:name="Medium List 1 Accent 3" w:semiHidden="0" w:uiPriority="65" w:unhideWhenUsed="0"/>
-    <w:lsdException w:name="Medium List 2 Accent 3" w:semiHidden="0" w:uiPriority="66" w:unhideWhenUsed="0"/>
-    <w:lsdException w:name="Medium Grid 1 Accent 3" w:semiHidden="0" w:uiPriority="67" w:unhideWhenUsed="0"/>
-    <w:lsdException w:name="Medium Grid 2 Accent 3" w:semiHidden="0" w:uiPriority="68" w:unhideWhenUsed="0"/>
-    <w:lsdException w:name="Medium Grid 3 Accent 3" w:semiHidden="0" w:uiPriority="69" w:unhideWhenUsed="0"/>
-    <w:lsdException w:name="Dark List Accent 3" w:semiHidden="0" w:uiPriority="70" w:unhideWhenUsed="0"/>
-    <w:lsdException w:name="Colorful Shading Accent 3" w:semiHidden="0" w:uiPriority="71" w:unhideWhenUsed="0"/>
-    <w:lsdException w:name="Colorful List Accent 3" w:semiHidden="0" w:uiPriority="72" w:unhideWhenUsed="0"/>
-    <w:lsdException w:name="Colorful Grid Accent 3" w:semiHidden="0" w:uiPriority="73" w:unhideWhenUsed="0"/>
-    <w:lsdException w:name="Light Shading Accent 4" w:semiHidden="0" w:uiPriority="60" w:unhideWhenUsed="0"/>
-    <w:lsdException w:name="Light List Accent 4" w:semiHidden="0" w:uiPriority="61" w:unhideWhenUsed="0"/>
-    <w:lsdException w:name="Light Grid Accent 4" w:semiHidden="0" w:uiPriority="62" w:unhideWhenUsed="0"/>
-    <w:lsdException w:name="Medium Shading 1 Accent 4" w:semiHidden="0" w:uiPriority="63" w:unhideWhenUsed="0"/>
-    <w:lsdException w:name="Medium Shading 2 Accent 4" w:semiHidden="0" w:uiPriority="64" w:unhideWhenUsed="0"/>
-    <w:lsdException w:name="Medium List 1 Accent 4" w:semiHidden="0" w:uiPriority="65" w:unhideWhenUsed="0"/>
-    <w:lsdException w:name="Medium List 2 Accent 4" w:semiHidden="0" w:uiPriority="66" w:unhideWhenUsed="0"/>
-    <w:lsdException w:name="Medium Grid 1 Accent 4" w:semiHidden="0" w:uiPriority="67" w:unhideWhenUsed="0"/>
-    <w:lsdException w:name="Medium Grid 2 Accent 4" w:semiHidden="0" w:uiPriority="68" w:unhideWhenUsed="0"/>
-    <w:lsdException w:name="Medium Grid 3 Accent 4" w:semiHidden="0" w:uiPriority="69" w:unhideWhenUsed="0"/>
-    <w:lsdException w:name="Dark List Accent 4" w:semiHidden="0" w:uiPriority="70" w:unhideWhenUsed="0"/>
-    <w:lsdException w:name="Colorful Shading Accent 4" w:semiHidden="0" w:uiPriority="71" w:unhideWhenUsed="0"/>
-    <w:lsdException w:name="Colorful List Accent 4" w:semiHidden="0" w:uiPriority="72" w:unhideWhenUsed="0"/>
-    <w:lsdException w:name="Colorful Grid Accent 4" w:semiHidden="0" w:uiPriority="73" w:unhideWhenUsed="0"/>
-    <w:lsdException w:name="Light Shading Accent 5" w:semiHidden="0" w:uiPriority="60" w:unhideWhenUsed="0"/>
-    <w:lsdException w:name="Light List Accent 5" w:semiHidden="0" w:uiPriority="61" w:unhideWhenUsed="0"/>
-    <w:lsdException w:name="Light Grid Accent 5" w:semiHidden="0" w:uiPriority="62" w:unhideWhenUsed="0"/>
-    <w:lsdException w:name="Medium Shading 1 Accent 5" w:semiHidden="0" w:uiPriority="63" w:unhideWhenUsed="0"/>
-    <w:lsdException w:name="Medium Shading 2 Accent 5" w:semiHidden="0" w:uiPriority="64" w:unhideWhenUsed="0"/>
-    <w:lsdException w:name="Medium List 1 Accent 5" w:semiHidden="0" w:uiPriority="65" w:unhideWhenUsed="0"/>
-    <w:lsdException w:name="Medium List 2 Accent 5" w:semiHidden="0" w:uiPriority="66" w:unhideWhenUsed="0"/>
-    <w:lsdException w:name="Medium Grid 1 Accent 5" w:semiHidden="0" w:uiPriority="67" w:unhideWhenUsed="0"/>
-    <w:lsdException w:name="Medium Grid 2 Accent 5" w:semiHidden="0" w:uiPriority="68" w:unhideWhenUsed="0"/>
-    <w:lsdException w:name="Medium Grid 3 Accent 5" w:semiHidden="0" w:uiPriority="69" w:unhideWhenUsed="0"/>
-    <w:lsdException w:name="Dark List Accent 5" w:semiHidden="0" w:uiPriority="70" w:unhideWhenUsed="0"/>
-    <w:lsdException w:name="Colorful Shading Accent 5" w:semiHidden="0" w:uiPriority="71" w:unhideWhenUsed="0"/>
-    <w:lsdException w:name="Colorful List Accent 5" w:semiHidden="0" w:uiPriority="72" w:unhideWhenUsed="0"/>
-    <w:lsdException w:name="Colorful Grid Accent 5" w:semiHidden="0" w:uiPriority="73" w:unhideWhenUsed="0"/>
-    <w:lsdException w:name="Light Shading Accent 6" w:semiHidden="0" w:uiPriority="60" w:unhideWhenUsed="0"/>
-    <w:lsdException w:name="Light List Accent 6" w:semiHidden="0" w:uiPriority="61" w:unhideWhenUsed="0"/>
-    <w:lsdException w:name="Light Grid Accent 6" w:semiHidden="0" w:uiPriority="62" w:unhideWhenUsed="0"/>
-    <w:lsdException w:name="Medium Shading 1 Accent 6" w:semiHidden="0" w:uiPriority="63" w:unhideWhenUsed="0"/>
-    <w:lsdException w:name="Medium Shading 2 Accent 6" w:semiHidden="0" w:uiPriority="64" w:unhideWhenUsed="0"/>
-    <w:lsdException w:name="Medium List 1 Accent 6" w:semiHidden="0" w:uiPriority="65" w:unhideWhenUsed="0"/>
-    <w:lsdException w:name="Medium List 2 Accent 6" w:semiHidden="0" w:uiPriority="66" w:unhideWhenUsed="0"/>
-    <w:lsdException w:name="Medium Grid 1 Accent 6" w:semiHidden="0" w:uiPriority="67" w:unhideWhenUsed="0"/>
-    <w:lsdException w:name="Medium Grid 2 Accent 6" w:semiHidden="0" w:uiPriority="68" w:unhideWhenUsed="0"/>
-    <w:lsdException w:name="Medium Grid 3 Accent 6" w:semiHidden="0" w:uiPriority="69" w:unhideWhenUsed="0"/>
-    <w:lsdException w:name="Dark List Accent 6" w:semiHidden="0" w:uiPriority="70" w:unhideWhenUsed="0"/>
-    <w:lsdException w:name="Colorful Shading Accent 6" w:semiHidden="0" w:uiPriority="71" w:unhideWhenUsed="0"/>
-    <w:lsdException w:name="Colorful List Accent 6" w:semiHidden="0" w:uiPriority="72" w:unhideWhenUsed="0"/>
-    <w:lsdException w:name="Colorful Grid Accent 6" w:semiHidden="0" w:uiPriority="73" w:unhideWhenUsed="0"/>
-    <w:lsdException w:name="Subtle Emphasis" w:semiHidden="0" w:uiPriority="19" w:unhideWhenUsed="0" w:qFormat="1"/>
-    <w:lsdException w:name="Intense Emphasis" w:semiHidden="0" w:uiPriority="21" w:unhideWhenUsed="0" w:qFormat="1"/>
-    <w:lsdException w:name="Subtle Reference" w:semiHidden="0" w:uiPriority="31" w:unhideWhenUsed="0" w:qFormat="1"/>
-    <w:lsdException w:name="Intense Reference" w:semiHidden="0" w:uiPriority="32" w:unhideWhenUsed="0" w:qFormat="1"/>
-    <w:lsdException w:name="Book Title" w:semiHidden="0" w:uiPriority="33" w:unhideWhenUsed="0" w:qFormat="1"/>
-    <w:lsdException w:name="Bibliography" w:uiPriority="37"/>
-    <w:lsdException w:name="TOC Heading" w:uiPriority="39" w:qFormat="1"/>
+  <w:latentStyles w:defLockedState="0" w:defUIPriority="99" w:defSemiHidden="0" w:defUnhideWhenUsed="0" w:defQFormat="0" w:count="376">
+    <w:lsdException w:name="Normal" w:uiPriority="0" w:qFormat="1"/>
+    <w:lsdException w:name="heading 1" w:uiPriority="9" w:qFormat="1"/>
+    <w:lsdException w:name="heading 2" w:semiHidden="1" w:uiPriority="9" w:unhideWhenUsed="1" w:qFormat="1"/>
+    <w:lsdException w:name="heading 3" w:semiHidden="1" w:uiPriority="9" w:unhideWhenUsed="1" w:qFormat="1"/>
+    <w:lsdException w:name="heading 4" w:semiHidden="1" w:uiPriority="9" w:unhideWhenUsed="1" w:qFormat="1"/>
+    <w:lsdException w:name="heading 5" w:semiHidden="1" w:uiPriority="9" w:unhideWhenUsed="1" w:qFormat="1"/>
+    <w:lsdException w:name="heading 6" w:semiHidden="1" w:uiPriority="9" w:unhideWhenUsed="1" w:qFormat="1"/>
+    <w:lsdException w:name="heading 7" w:semiHidden="1" w:uiPriority="9" w:unhideWhenUsed="1" w:qFormat="1"/>
+    <w:lsdException w:name="heading 8" w:semiHidden="1" w:uiPriority="9" w:unhideWhenUsed="1" w:qFormat="1"/>
+    <w:lsdException w:name="heading 9" w:semiHidden="1" w:uiPriority="9" w:unhideWhenUsed="1" w:qFormat="1"/>
+    <w:lsdException w:name="index 1" w:semiHidden="1" w:unhideWhenUsed="1"/>
+    <w:lsdException w:name="index 2" w:semiHidden="1" w:unhideWhenUsed="1"/>
+    <w:lsdException w:name="index 3" w:semiHidden="1" w:unhideWhenUsed="1"/>
+    <w:lsdException w:name="index 4" w:semiHidden="1" w:unhideWhenUsed="1"/>
+    <w:lsdException w:name="index 5" w:semiHidden="1" w:unhideWhenUsed="1"/>
+    <w:lsdException w:name="index 6" w:semiHidden="1" w:unhideWhenUsed="1"/>
+    <w:lsdException w:name="index 7" w:semiHidden="1" w:unhideWhenUsed="1"/>
+    <w:lsdException w:name="index 8" w:semiHidden="1" w:unhideWhenUsed="1"/>
+    <w:lsdException w:name="index 9" w:semiHidden="1" w:unhideWhenUsed="1"/>
+    <w:lsdException w:name="toc 1" w:semiHidden="1" w:uiPriority="39" w:unhideWhenUsed="1"/>
+    <w:lsdException w:name="toc 2" w:semiHidden="1" w:uiPriority="39" w:unhideWhenUsed="1"/>
+    <w:lsdException w:name="toc 3" w:semiHidden="1" w:uiPriority="39" w:unhideWhenUsed="1"/>
+    <w:lsdException w:name="toc 4" w:semiHidden="1" w:uiPriority="39" w:unhideWhenUsed="1"/>
+    <w:lsdException w:name="toc 5" w:semiHidden="1" w:uiPriority="39" w:unhideWhenUsed="1"/>
+    <w:lsdException w:name="toc 6" w:semiHidden="1" w:uiPriority="39" w:unhideWhenUsed="1"/>
+    <w:lsdException w:name="toc 7" w:semiHidden="1" w:uiPriority="39" w:unhideWhenUsed="1"/>
+    <w:lsdException w:name="toc 8" w:semiHidden="1" w:uiPriority="39" w:unhideWhenUsed="1"/>
+    <w:lsdException w:name="toc 9" w:semiHidden="1" w:uiPriority="39" w:unhideWhenUsed="1"/>
+    <w:lsdException w:name="Normal Indent" w:semiHidden="1" w:unhideWhenUsed="1"/>
+    <w:lsdException w:name="footnote text" w:semiHidden="1" w:unhideWhenUsed="1"/>
+    <w:lsdException w:name="annotation text" w:semiHidden="1" w:unhideWhenUsed="1"/>
+    <w:lsdException w:name="header" w:semiHidden="1" w:unhideWhenUsed="1"/>
+    <w:lsdException w:name="footer" w:semiHidden="1" w:unhideWhenUsed="1"/>
+    <w:lsdException w:name="index heading" w:semiHidden="1" w:unhideWhenUsed="1"/>
+    <w:lsdException w:name="caption" w:semiHidden="1" w:uiPriority="35" w:unhideWhenUsed="1" w:qFormat="1"/>
+    <w:lsdException w:name="table of figures" w:semiHidden="1" w:unhideWhenUsed="1"/>
+    <w:lsdException w:name="envelope address" w:semiHidden="1" w:unhideWhenUsed="1"/>
+    <w:lsdException w:name="envelope return" w:semiHidden="1" w:unhideWhenUsed="1"/>
+    <w:lsdException w:name="footnote reference" w:semiHidden="1" w:unhideWhenUsed="1"/>
+    <w:lsdException w:name="annotation reference" w:semiHidden="1" w:unhideWhenUsed="1"/>
+    <w:lsdException w:name="line number" w:semiHidden="1" w:unhideWhenUsed="1"/>
+    <w:lsdException w:name="page number" w:semiHidden="1" w:unhideWhenUsed="1"/>
+    <w:lsdException w:name="endnote reference" w:semiHidden="1" w:unhideWhenUsed="1"/>
+    <w:lsdException w:name="endnote text" w:semiHidden="1" w:unhideWhenUsed="1"/>
+    <w:lsdException w:name="table of authorities" w:semiHidden="1" w:unhideWhenUsed="1"/>
+    <w:lsdException w:name="macro" w:semiHidden="1" w:unhideWhenUsed="1"/>
+    <w:lsdException w:name="toa heading" w:semiHidden="1" w:unhideWhenUsed="1"/>
+    <w:lsdException w:name="List" w:semiHidden="1" w:unhideWhenUsed="1"/>
+    <w:lsdException w:name="List Bullet" w:semiHidden="1" w:unhideWhenUsed="1"/>
+    <w:lsdException w:name="List Number" w:semiHidden="1" w:unhideWhenUsed="1"/>
+    <w:lsdException w:name="List 2" w:semiHidden="1" w:unhideWhenUsed="1"/>
+    <w:lsdException w:name="List 3" w:semiHidden="1" w:unhideWhenUsed="1"/>
+    <w:lsdException w:name="List 4" w:semiHidden="1" w:unhideWhenUsed="1"/>
+    <w:lsdException w:name="List 5" w:semiHidden="1" w:unhideWhenUsed="1"/>
+    <w:lsdException w:name="List Bullet 2" w:semiHidden="1" w:unhideWhenUsed="1"/>
+    <w:lsdException w:name="List Bullet 3" w:semiHidden="1" w:unhideWhenUsed="1"/>
+    <w:lsdException w:name="List Bullet 4" w:semiHidden="1" w:unhideWhenUsed="1"/>
+    <w:lsdException w:name="List Bullet 5" w:semiHidden="1" w:unhideWhenUsed="1"/>
+    <w:lsdException w:name="List Number 2" w:semiHidden="1" w:unhideWhenUsed="1"/>
+    <w:lsdException w:name="List Number 3" w:semiHidden="1" w:unhideWhenUsed="1"/>
+    <w:lsdException w:name="List Number 4" w:semiHidden="1" w:unhideWhenUsed="1"/>
+    <w:lsdException w:name="List Number 5" w:semiHidden="1" w:unhideWhenUsed="1"/>
+    <w:lsdException w:name="Title" w:uiPriority="10" w:qFormat="1"/>
+    <w:lsdException w:name="Closing" w:semiHidden="1" w:unhideWhenUsed="1"/>
+    <w:lsdException w:name="Signature" w:semiHidden="1" w:unhideWhenUsed="1"/>
+    <w:lsdException w:name="Default Paragraph Font" w:semiHidden="1" w:uiPriority="1" w:unhideWhenUsed="1"/>
+    <w:lsdException w:name="Body Text" w:semiHidden="1" w:unhideWhenUsed="1"/>
+    <w:lsdException w:name="Body Text Indent" w:semiHidden="1" w:unhideWhenUsed="1"/>
+    <w:lsdException w:name="List Continue" w:semiHidden="1" w:unhideWhenUsed="1"/>
+    <w:lsdException w:name="List Continue 2" w:semiHidden="1" w:unhideWhenUsed="1"/>
+    <w:lsdException w:name="List Continue 3" w:semiHidden="1" w:unhideWhenUsed="1"/>
+    <w:lsdException w:name="List Continue 4" w:semiHidden="1" w:unhideWhenUsed="1"/>
+    <w:lsdException w:name="List Continue 5" w:semiHidden="1" w:unhideWhenUsed="1"/>
+    <w:lsdException w:name="Message Header" w:semiHidden="1" w:unhideWhenUsed="1"/>
+    <w:lsdException w:name="Subtitle" w:uiPriority="11" w:qFormat="1"/>
+    <w:lsdException w:name="Salutation" w:semiHidden="1" w:unhideWhenUsed="1"/>
+    <w:lsdException w:name="Date" w:semiHidden="1" w:unhideWhenUsed="1"/>
+    <w:lsdException w:name="Body Text First Indent" w:semiHidden="1" w:unhideWhenUsed="1"/>
+    <w:lsdException w:name="Body Text First Indent 2" w:semiHidden="1" w:unhideWhenUsed="1"/>
+    <w:lsdException w:name="Note Heading" w:semiHidden="1" w:unhideWhenUsed="1"/>
+    <w:lsdException w:name="Body Text 2" w:semiHidden="1" w:unhideWhenUsed="1"/>
+    <w:lsdException w:name="Body Text 3" w:semiHidden="1" w:unhideWhenUsed="1"/>
+    <w:lsdException w:name="Body Text Indent 2" w:semiHidden="1" w:unhideWhenUsed="1"/>
+    <w:lsdException w:name="Body Text Indent 3" w:semiHidden="1" w:unhideWhenUsed="1"/>
+    <w:lsdException w:name="Block Text" w:semiHidden="1" w:unhideWhenUsed="1"/>
+    <w:lsdException w:name="Hyperlink" w:semiHidden="1" w:unhideWhenUsed="1"/>
+    <w:lsdException w:name="FollowedHyperlink" w:semiHidden="1" w:unhideWhenUsed="1"/>
+    <w:lsdException w:name="Strong" w:uiPriority="22" w:qFormat="1"/>
+    <w:lsdException w:name="Emphasis" w:uiPriority="20" w:qFormat="1"/>
+    <w:lsdException w:name="Document Map" w:semiHidden="1" w:unhideWhenUsed="1"/>
+    <w:lsdException w:name="Plain Text" w:semiHidden="1" w:unhideWhenUsed="1"/>
+    <w:lsdException w:name="E-mail Signature" w:semiHidden="1" w:unhideWhenUsed="1"/>
+    <w:lsdException w:name="HTML Top of Form" w:semiHidden="1" w:unhideWhenUsed="1"/>
+    <w:lsdException w:name="HTML Bottom of Form" w:semiHidden="1" w:unhideWhenUsed="1"/>
+    <w:lsdException w:name="Normal (Web)" w:semiHidden="1" w:unhideWhenUsed="1"/>
+    <w:lsdException w:name="HTML Acronym" w:semiHidden="1" w:unhideWhenUsed="1"/>
+    <w:lsdException w:name="HTML Address" w:semiHidden="1" w:unhideWhenUsed="1"/>
+    <w:lsdException w:name="HTML Cite" w:semiHidden="1" w:unhideWhenUsed="1"/>
+    <w:lsdException w:name="HTML Code" w:semiHidden="1" w:unhideWhenUsed="1"/>
+    <w:lsdException w:name="HTML Definition" w:semiHidden="1" w:unhideWhenUsed="1"/>
+    <w:lsdException w:name="HTML Keyboard" w:semiHidden="1" w:unhideWhenUsed="1"/>
+    <w:lsdException w:name="HTML Preformatted" w:semiHidden="1" w:unhideWhenUsed="1"/>
+    <w:lsdException w:name="HTML Sample" w:semiHidden="1" w:unhideWhenUsed="1"/>
+    <w:lsdException w:name="HTML Typewriter" w:semiHidden="1" w:unhideWhenUsed="1"/>
+    <w:lsdException w:name="HTML Variable" w:semiHidden="1" w:unhideWhenUsed="1"/>
+    <w:lsdException w:name="Normal Table" w:semiHidden="1" w:unhideWhenUsed="1"/>
+    <w:lsdException w:name="annotation subject" w:semiHidden="1" w:unhideWhenUsed="1"/>
+    <w:lsdException w:name="No List" w:semiHidden="1" w:unhideWhenUsed="1"/>
+    <w:lsdException w:name="Outline List 1" w:semiHidden="1" w:unhideWhenUsed="1"/>
+    <w:lsdException w:name="Outline List 2" w:semiHidden="1" w:unhideWhenUsed="1"/>
+    <w:lsdException w:name="Outline List 3" w:semiHidden="1" w:unhideWhenUsed="1"/>
+    <w:lsdException w:name="Table Simple 1" w:semiHidden="1" w:unhideWhenUsed="1"/>
+    <w:lsdException w:name="Table Simple 2" w:semiHidden="1" w:unhideWhenUsed="1"/>
+    <w:lsdException w:name="Table Simple 3" w:semiHidden="1" w:unhideWhenUsed="1"/>
+    <w:lsdException w:name="Table Classic 1" w:semiHidden="1" w:unhideWhenUsed="1"/>
+    <w:lsdException w:name="Table Classic 2" w:semiHidden="1" w:unhideWhenUsed="1"/>
+    <w:lsdException w:name="Table Classic 3" w:semiHidden="1" w:unhideWhenUsed="1"/>
+    <w:lsdException w:name="Table Classic 4" w:semiHidden="1" w:unhideWhenUsed="1"/>
+    <w:lsdException w:name="Table Colorful 1" w:semiHidden="1" w:unhideWhenUsed="1"/>
+    <w:lsdException w:name="Table Colorful 2" w:semiHidden="1" w:unhideWhenUsed="1"/>
+    <w:lsdException w:name="Table Colorful 3" w:semiHidden="1" w:unhideWhenUsed="1"/>
+    <w:lsdException w:name="Table Columns 1" w:semiHidden="1" w:unhideWhenUsed="1"/>
+    <w:lsdException w:name="Table Columns 2" w:semiHidden="1" w:unhideWhenUsed="1"/>
+    <w:lsdException w:name="Table Columns 3" w:semiHidden="1" w:unhideWhenUsed="1"/>
+    <w:lsdException w:name="Table Columns 4" w:semiHidden="1" w:unhideWhenUsed="1"/>
+    <w:lsdException w:name="Table Columns 5" w:semiHidden="1" w:unhideWhenUsed="1"/>
+    <w:lsdException w:name="Table Grid 1" w:semiHidden="1" w:unhideWhenUsed="1"/>
+    <w:lsdException w:name="Table Grid 2" w:semiHidden="1" w:unhideWhenUsed="1"/>
+    <w:lsdException w:name="Table Grid 3" w:semiHidden="1" w:unhideWhenUsed="1"/>
+    <w:lsdException w:name="Table Grid 4" w:semiHidden="1" w:unhideWhenUsed="1"/>
+    <w:lsdException w:name="Table Grid 5" w:semiHidden="1" w:unhideWhenUsed="1"/>
+    <w:lsdException w:name="Table Grid 6" w:semiHidden="1" w:unhideWhenUsed="1"/>
+    <w:lsdException w:name="Table Grid 7" w:semiHidden="1" w:unhideWhenUsed="1"/>
+    <w:lsdException w:name="Table Grid 8" w:semiHidden="1" w:unhideWhenUsed="1"/>
+    <w:lsdException w:name="Table List 1" w:semiHidden="1" w:unhideWhenUsed="1"/>
+    <w:lsdException w:name="Table List 2" w:semiHidden="1" w:unhideWhenUsed="1"/>
+    <w:lsdException w:name="Table List 3" w:semiHidden="1" w:unhideWhenUsed="1"/>
+    <w:lsdException w:name="Table List 4" w:semiHidden="1" w:unhideWhenUsed="1"/>
+    <w:lsdException w:name="Table List 5" w:semiHidden="1" w:unhideWhenUsed="1"/>
+    <w:lsdException w:name="Table List 6" w:semiHidden="1" w:unhideWhenUsed="1"/>
+    <w:lsdException w:name="Table List 7" w:semiHidden="1" w:unhideWhenUsed="1"/>
+    <w:lsdException w:name="Table List 8" w:semiHidden="1" w:unhideWhenUsed="1"/>
+    <w:lsdException w:name="Table 3D effects 1" w:semiHidden="1" w:unhideWhenUsed="1"/>
+    <w:lsdException w:name="Table 3D effects 2" w:semiHidden="1" w:unhideWhenUsed="1"/>
+    <w:lsdException w:name="Table 3D effects 3" w:semiHidden="1" w:unhideWhenUsed="1"/>
+    <w:lsdException w:name="Table Contemporary" w:semiHidden="1" w:unhideWhenUsed="1"/>
+    <w:lsdException w:name="Table Elegant" w:semiHidden="1" w:unhideWhenUsed="1"/>
+    <w:lsdException w:name="Table Professional" w:semiHidden="1" w:unhideWhenUsed="1"/>
+    <w:lsdException w:name="Table Subtle 1" w:semiHidden="1" w:unhideWhenUsed="1"/>
+    <w:lsdException w:name="Table Subtle 2" w:semiHidden="1" w:unhideWhenUsed="1"/>
+    <w:lsdException w:name="Table Web 1" w:semiHidden="1" w:unhideWhenUsed="1"/>
+    <w:lsdException w:name="Table Web 2" w:semiHidden="1" w:unhideWhenUsed="1"/>
+    <w:lsdException w:name="Table Web 3" w:semiHidden="1" w:unhideWhenUsed="1"/>
+    <w:lsdException w:name="Balloon Text" w:semiHidden="1" w:unhideWhenUsed="1"/>
+    <w:lsdException w:name="Table Grid" w:semiHidden="1" w:uiPriority="59" w:unhideWhenUsed="1"/>
+    <w:lsdException w:name="Table Theme" w:semiHidden="1" w:unhideWhenUsed="1"/>
+    <w:lsdException w:name="Placeholder Text" w:semiHidden="1"/>
+    <w:lsdException w:name="No Spacing" w:uiPriority="1" w:qFormat="1"/>
+    <w:lsdException w:name="Light Shading" w:uiPriority="60"/>
+    <w:lsdException w:name="Light List" w:uiPriority="61"/>
+    <w:lsdException w:name="Light Grid" w:uiPriority="62"/>
+    <w:lsdException w:name="Medium Shading 1" w:uiPriority="63"/>
+    <w:lsdException w:name="Medium Shading 2" w:uiPriority="64"/>
+    <w:lsdException w:name="Medium List 1" w:uiPriority="65"/>
+    <w:lsdException w:name="Medium List 2" w:uiPriority="66"/>
+    <w:lsdException w:name="Medium Grid 1" w:uiPriority="67"/>
+    <w:lsdException w:name="Medium Grid 2" w:uiPriority="68"/>
+    <w:lsdException w:name="Medium Grid 3" w:uiPriority="69"/>
+    <w:lsdException w:name="Dark List" w:uiPriority="70"/>
+    <w:lsdException w:name="Colorful Shading" w:uiPriority="71"/>
+    <w:lsdException w:name="Colorful List" w:uiPriority="72"/>
+    <w:lsdException w:name="Colorful Grid" w:uiPriority="73"/>
+    <w:lsdException w:name="Light Shading Accent 1" w:uiPriority="60"/>
+    <w:lsdException w:name="Light List Accent 1" w:uiPriority="61"/>
+    <w:lsdException w:name="Light Grid Accent 1" w:uiPriority="62"/>
+    <w:lsdException w:name="Medium Shading 1 Accent 1" w:uiPriority="63"/>
+    <w:lsdException w:name="Medium Shading 2 Accent 1" w:uiPriority="64"/>
+    <w:lsdException w:name="Medium List 1 Accent 1" w:uiPriority="65"/>
+    <w:lsdException w:name="Revision" w:semiHidden="1"/>
+    <w:lsdException w:name="List Paragraph" w:uiPriority="34" w:qFormat="1"/>
+    <w:lsdException w:name="Quote" w:uiPriority="29" w:qFormat="1"/>
+    <w:lsdException w:name="Intense Quote" w:uiPriority="30" w:qFormat="1"/>
+    <w:lsdException w:name="Medium List 2 Accent 1" w:uiPriority="66"/>
+    <w:lsdException w:name="Medium Grid 1 Accent 1" w:uiPriority="67"/>
+    <w:lsdException w:name="Medium Grid 2 Accent 1" w:uiPriority="68"/>
+    <w:lsdException w:name="Medium Grid 3 Accent 1" w:uiPriority="69"/>
+    <w:lsdException w:name="Dark List Accent 1" w:uiPriority="70"/>
+    <w:lsdException w:name="Colorful Shading Accent 1" w:uiPriority="71"/>
+    <w:lsdException w:name="Colorful List Accent 1" w:uiPriority="72"/>
+    <w:lsdException w:name="Colorful Grid Accent 1" w:uiPriority="73"/>
+    <w:lsdException w:name="Light Shading Accent 2" w:uiPriority="60"/>
+    <w:lsdException w:name="Light List Accent 2" w:uiPriority="61"/>
+    <w:lsdException w:name="Light Grid Accent 2" w:uiPriority="62"/>
+    <w:lsdException w:name="Medium Shading 1 Accent 2" w:uiPriority="63"/>
+    <w:lsdException w:name="Medium Shading 2 Accent 2" w:uiPriority="64"/>
+    <w:lsdException w:name="Medium List 1 Accent 2" w:uiPriority="65"/>
+    <w:lsdException w:name="Medium List 2 Accent 2" w:uiPriority="66"/>
+    <w:lsdException w:name="Medium Grid 1 Accent 2" w:uiPriority="67"/>
+    <w:lsdException w:name="Medium Grid 2 Accent 2" w:uiPriority="68"/>
+    <w:lsdException w:name="Medium Grid 3 Accent 2" w:uiPriority="69"/>
+    <w:lsdException w:name="Dark List Accent 2" w:uiPriority="70"/>
+    <w:lsdException w:name="Colorful Shading Accent 2" w:uiPriority="71"/>
+    <w:lsdException w:name="Colorful List Accent 2" w:uiPriority="72"/>
+    <w:lsdException w:name="Colorful Grid Accent 2" w:uiPriority="73"/>
+    <w:lsdException w:name="Light Shading Accent 3" w:uiPriority="60"/>
+    <w:lsdException w:name="Light List Accent 3" w:uiPriority="61"/>
+    <w:lsdException w:name="Light Grid Accent 3" w:uiPriority="62"/>
+    <w:lsdException w:name="Medium Shading 1 Accent 3" w:uiPriority="63"/>
+    <w:lsdException w:name="Medium Shading 2 Accent 3" w:uiPriority="64"/>
+    <w:lsdException w:name="Medium List 1 Accent 3" w:uiPriority="65"/>
+    <w:lsdException w:name="Medium List 2 Accent 3" w:uiPriority="66"/>
+    <w:lsdException w:name="Medium Grid 1 Accent 3" w:uiPriority="67"/>
+    <w:lsdException w:name="Medium Grid 2 Accent 3" w:uiPriority="68"/>
+    <w:lsdException w:name="Medium Grid 3 Accent 3" w:uiPriority="69"/>
+    <w:lsdException w:name="Dark List Accent 3" w:uiPriority="70"/>
+    <w:lsdException w:name="Colorful Shading Accent 3" w:uiPriority="71"/>
+    <w:lsdException w:name="Colorful List Accent 3" w:uiPriority="72"/>
+    <w:lsdException w:name="Colorful Grid Accent 3" w:uiPriority="73"/>
+    <w:lsdException w:name="Light Shading Accent 4" w:uiPriority="60"/>
+    <w:lsdException w:name="Light List Accent 4" w:uiPriority="61"/>
+    <w:lsdException w:name="Light Grid Accent 4" w:uiPriority="62"/>
+    <w:lsdException w:name="Medium Shading 1 Accent 4" w:uiPriority="63"/>
+    <w:lsdException w:name="Medium Shading 2 Accent 4" w:uiPriority="64"/>
+    <w:lsdException w:name="Medium List 1 Accent 4" w:uiPriority="65"/>
+    <w:lsdException w:name="Medium List 2 Accent 4" w:uiPriority="66"/>
+    <w:lsdException w:name="Medium Grid 1 Accent 4" w:uiPriority="67"/>
+    <w:lsdException w:name="Medium Grid 2 Accent 4" w:uiPriority="68"/>
+    <w:lsdException w:name="Medium Grid 3 Accent 4" w:uiPriority="69"/>
+    <w:lsdException w:name="Dark List Accent 4" w:uiPriority="70"/>
+    <w:lsdException w:name="Colorful Shading Accent 4" w:uiPriority="71"/>
+    <w:lsdException w:name="Colorful List Accent 4" w:uiPriority="72"/>
+    <w:lsdException w:name="Colorful Grid Accent 4" w:uiPriority="73"/>
+    <w:lsdException w:name="Light Shading Accent 5" w:uiPriority="60"/>
+    <w:lsdException w:name="Light List Accent 5" w:uiPriority="61"/>
+    <w:lsdException w:name="Light Grid Accent 5" w:uiPriority="62"/>
+    <w:lsdException w:name="Medium Shading 1 Accent 5" w:uiPriority="63"/>
+    <w:lsdException w:name="Medium Shading 2 Accent 5" w:uiPriority="64"/>
+    <w:lsdException w:name="Medium List 1 Accent 5" w:uiPriority="65"/>
+    <w:lsdException w:name="Medium List 2 Accent 5" w:uiPriority="66"/>
+    <w:lsdException w:name="Medium Grid 1 Accent 5" w:uiPriority="67"/>
+    <w:lsdException w:name="Medium Grid 2 Accent 5" w:uiPriority="68"/>
+    <w:lsdException w:name="Medium Grid 3 Accent 5" w:uiPriority="69"/>
+    <w:lsdException w:name="Dark List Accent 5" w:uiPriority="70"/>
+    <w:lsdException w:name="Colorful Shading Accent 5" w:uiPriority="71"/>
+    <w:lsdException w:name="Colorful List Accent 5" w:uiPriority="72"/>
+    <w:lsdException w:name="Colorful Grid Accent 5" w:uiPriority="73"/>
+    <w:lsdException w:name="Light Shading Accent 6" w:uiPriority="60"/>
+    <w:lsdException w:name="Light List Accent 6" w:uiPriority="61"/>
+    <w:lsdException w:name="Light Grid Accent 6" w:uiPriority="62"/>
+    <w:lsdException w:name="Medium Shading 1 Accent 6" w:uiPriority="63"/>
+    <w:lsdException w:name="Medium Shading 2 Accent 6" w:uiPriority="64"/>
+    <w:lsdException w:name="Medium List 1 Accent 6" w:uiPriority="65"/>
+    <w:lsdException w:name="Medium List 2 Accent 6" w:uiPriority="66"/>
+    <w:lsdException w:name="Medium Grid 1 Accent 6" w:uiPriority="67"/>
+    <w:lsdException w:name="Medium Grid 2 Accent 6" w:uiPriority="68"/>
+    <w:lsdException w:name="Medium Grid 3 Accent 6" w:uiPriority="69"/>
+    <w:lsdException w:name="Dark List Accent 6" w:uiPriority="70"/>
+    <w:lsdException w:name="Colorful Shading Accent 6" w:uiPriority="71"/>
+    <w:lsdException w:name="Colorful List Accent 6" w:uiPriority="72"/>
+    <w:lsdException w:name="Colorful Grid Accent 6" w:uiPriority="73"/>
+    <w:lsdException w:name="Subtle Emphasis" w:uiPriority="19" w:qFormat="1"/>
+    <w:lsdException w:name="Intense Emphasis" w:uiPriority="21" w:qFormat="1"/>
+    <w:lsdException w:name="Subtle Reference" w:uiPriority="31" w:qFormat="1"/>
+    <w:lsdException w:name="Intense Reference" w:uiPriority="32" w:qFormat="1"/>
+    <w:lsdException w:name="Book Title" w:uiPriority="33" w:qFormat="1"/>
+    <w:lsdException w:name="Bibliography" w:semiHidden="1" w:uiPriority="37" w:unhideWhenUsed="1"/>
+    <w:lsdException w:name="TOC Heading" w:semiHidden="1" w:uiPriority="39" w:unhideWhenUsed="1" w:qFormat="1"/>
+    <w:lsdException w:name="Plain Table 1" w:uiPriority="41"/>
+    <w:lsdException w:name="Plain Table 2" w:uiPriority="42"/>
+    <w:lsdException w:name="Plain Table 3" w:uiPriority="43"/>
+    <w:lsdException w:name="Plain Table 4" w:uiPriority="44"/>
+    <w:lsdException w:name="Plain Table 5" w:uiPriority="45"/>
+    <w:lsdException w:name="Grid Table Light" w:uiPriority="40"/>
+    <w:lsdException w:name="Grid Table 1 Light" w:uiPriority="46"/>
+    <w:lsdException w:name="Grid Table 2" w:uiPriority="47"/>
+    <w:lsdException w:name="Grid Table 3" w:uiPriority="48"/>
+    <w:lsdException w:name="Grid Table 4" w:uiPriority="49"/>
+    <w:lsdException w:name="Grid Table 5 Dark" w:uiPriority="50"/>
+    <w:lsdException w:name="Grid Table 6 Colorful" w:uiPriority="51"/>
+    <w:lsdException w:name="Grid Table 7 Colorful" w:uiPriority="52"/>
+    <w:lsdException w:name="Grid Table 1 Light Accent 1" w:uiPriority="46"/>
+    <w:lsdException w:name="Grid Table 2 Accent 1" w:uiPriority="47"/>
+    <w:lsdException w:name="Grid Table 3 Accent 1" w:uiPriority="48"/>
+    <w:lsdException w:name="Grid Table 4 Accent 1" w:uiPriority="49"/>
+    <w:lsdException w:name="Grid Table 5 Dark Accent 1" w:uiPriority="50"/>
+    <w:lsdException w:name="Grid Table 6 Colorful Accent 1" w:uiPriority="51"/>
+    <w:lsdException w:name="Grid Table 7 Colorful Accent 1" w:uiPriority="52"/>
+    <w:lsdException w:name="Grid Table 1 Light Accent 2" w:uiPriority="46"/>
+    <w:lsdException w:name="Grid Table 2 Accent 2" w:uiPriority="47"/>
+    <w:lsdException w:name="Grid Table 3 Accent 2" w:uiPriority="48"/>
+    <w:lsdException w:name="Grid Table 4 Accent 2" w:uiPriority="49"/>
+    <w:lsdException w:name="Grid Table 5 Dark Accent 2" w:uiPriority="50"/>
+    <w:lsdException w:name="Grid Table 6 Colorful Accent 2" w:uiPriority="51"/>
+    <w:lsdException w:name="Grid Table 7 Colorful Accent 2" w:uiPriority="52"/>
+    <w:lsdException w:name="Grid Table 1 Light Accent 3" w:uiPriority="46"/>
+    <w:lsdException w:name="Grid Table 2 Accent 3" w:uiPriority="47"/>
+    <w:lsdException w:name="Grid Table 3 Accent 3" w:uiPriority="48"/>
+    <w:lsdException w:name="Grid Table 4 Accent 3" w:uiPriority="49"/>
+    <w:lsdException w:name="Grid Table 5 Dark Accent 3" w:uiPriority="50"/>
+    <w:lsdException w:name="Grid Table 6 Colorful Accent 3" w:uiPriority="51"/>
+    <w:lsdException w:name="Grid Table 7 Colorful Accent 3" w:uiPriority="52"/>
+    <w:lsdException w:name="Grid Table 1 Light Accent 4" w:uiPriority="46"/>
+    <w:lsdException w:name="Grid Table 2 Accent 4" w:uiPriority="47"/>
+    <w:lsdException w:name="Grid Table 3 Accent 4" w:uiPriority="48"/>
+    <w:lsdException w:name="Grid Table 4 Accent 4" w:uiPriority="49"/>
+    <w:lsdException w:name="Grid Table 5 Dark Accent 4" w:uiPriority="50"/>
+    <w:lsdException w:name="Grid Table 6 Colorful Accent 4" w:uiPriority="51"/>
+    <w:lsdException w:name="Grid Table 7 Colorful Accent 4" w:uiPriority="52"/>
+    <w:lsdException w:name="Grid Table 1 Light Accent 5" w:uiPriority="46"/>
+    <w:lsdException w:name="Grid Table 2 Accent 5" w:uiPriority="47"/>
+    <w:lsdException w:name="Grid Table 3 Accent 5" w:uiPriority="48"/>
+    <w:lsdException w:name="Grid Table 4 Accent 5" w:uiPriority="49"/>
+    <w:lsdException w:name="Grid Table 5 Dark Accent 5" w:uiPriority="50"/>
+    <w:lsdException w:name="Grid Table 6 Colorful Accent 5" w:uiPriority="51"/>
+    <w:lsdException w:name="Grid Table 7 Colorful Accent 5" w:uiPriority="52"/>
+    <w:lsdException w:name="Grid Table 1 Light Accent 6" w:uiPriority="46"/>
+    <w:lsdException w:name="Grid Table 2 Accent 6" w:uiPriority="47"/>
+    <w:lsdException w:name="Grid Table 3 Accent 6" w:uiPriority="48"/>
+    <w:lsdException w:name="Grid Table 4 Accent 6" w:uiPriority="49"/>
+    <w:lsdException w:name="Grid Table 5 Dark Accent 6" w:uiPriority="50"/>
+    <w:lsdException w:name="Grid Table 6 Colorful Accent 6" w:uiPriority="51"/>
+    <w:lsdException w:name="Grid Table 7 Colorful Accent 6" w:uiPriority="52"/>
+    <w:lsdException w:name="List Table 1 Light" w:uiPriority="46"/>
+    <w:lsdException w:name="List Table 2" w:uiPriority="47"/>
+    <w:lsdException w:name="List Table 3" w:uiPriority="48"/>
+    <w:lsdException w:name="List Table 4" w:uiPriority="49"/>
+    <w:lsdException w:name="List Table 5 Dark" w:uiPriority="50"/>
+    <w:lsdException w:name="List Table 6 Colorful" w:uiPriority="51"/>
+    <w:lsdException w:name="List Table 7 Colorful" w:uiPriority="52"/>
+    <w:lsdException w:name="List Table 1 Light Accent 1" w:uiPriority="46"/>
+    <w:lsdException w:name="List Table 2 Accent 1" w:uiPriority="47"/>
+    <w:lsdException w:name="List Table 3 Accent 1" w:uiPriority="48"/>
+    <w:lsdException w:name="List Table 4 Accent 1" w:uiPriority="49"/>
+    <w:lsdException w:name="List Table 5 Dark Accent 1" w:uiPriority="50"/>
+    <w:lsdException w:name="List Table 6 Colorful Accent 1" w:uiPriority="51"/>
+    <w:lsdException w:name="List Table 7 Colorful Accent 1" w:uiPriority="52"/>
+    <w:lsdException w:name="List Table 1 Light Accent 2" w:uiPriority="46"/>
+    <w:lsdException w:name="List Table 2 Accent 2" w:uiPriority="47"/>
+    <w:lsdException w:name="List Table 3 Accent 2" w:uiPriority="48"/>
+    <w:lsdException w:name="List Table 4 Accent 2" w:uiPriority="49"/>
+    <w:lsdException w:name="List Table 5 Dark Accent 2" w:uiPriority="50"/>
+    <w:lsdException w:name="List Table 6 Colorful Accent 2" w:uiPriority="51"/>
+    <w:lsdException w:name="List Table 7 Colorful Accent 2" w:uiPriority="52"/>
+    <w:lsdException w:name="List Table 1 Light Accent 3" w:uiPriority="46"/>
+    <w:lsdException w:name="List Table 2 Accent 3" w:uiPriority="47"/>
+    <w:lsdException w:name="List Table 3 Accent 3" w:uiPriority="48"/>
+    <w:lsdException w:name="List Table 4 Accent 3" w:uiPriority="49"/>
+    <w:lsdException w:name="List Table 5 Dark Accent 3" w:uiPriority="50"/>
+    <w:lsdException w:name="List Table 6 Colorful Accent 3" w:uiPriority="51"/>
+    <w:lsdException w:name="List Table 7 Colorful Accent 3" w:uiPriority="52"/>
+    <w:lsdException w:name="List Table 1 Light Accent 4" w:uiPriority="46"/>
+    <w:lsdException w:name="List Table 2 Accent 4" w:uiPriority="47"/>
+    <w:lsdException w:name="List Table 3 Accent 4" w:uiPriority="48"/>
+    <w:lsdException w:name="List Table 4 Accent 4" w:uiPriority="49"/>
+    <w:lsdException w:name="List Table 5 Dark Accent 4" w:uiPriority="50"/>
+    <w:lsdException w:name="List Table 6 Colorful Accent 4" w:uiPriority="51"/>
+    <w:lsdException w:name="List Table 7 Colorful Accent 4" w:uiPriority="52"/>
+    <w:lsdException w:name="List Table 1 Light Accent 5" w:uiPriority="46"/>
+    <w:lsdException w:name="List Table 2 Accent 5" w:uiPriority="47"/>
+    <w:lsdException w:name="List Table 3 Accent 5" w:uiPriority="48"/>
+    <w:lsdException w:name="List Table 4 Accent 5" w:uiPriority="49"/>
+    <w:lsdException w:name="List Table 5 Dark Accent 5" w:uiPriority="50"/>
+    <w:lsdException w:name="List Table 6 Colorful Accent 5" w:uiPriority="51"/>
+    <w:lsdException w:name="List Table 7 Colorful Accent 5" w:uiPriority="52"/>
+    <w:lsdException w:name="List Table 1 Light Accent 6" w:uiPriority="46"/>
+    <w:lsdException w:name="List Table 2 Accent 6" w:uiPriority="47"/>
+    <w:lsdException w:name="List Table 3 Accent 6" w:uiPriority="48"/>
+    <w:lsdException w:name="List Table 4 Accent 6" w:uiPriority="49"/>
+    <w:lsdException w:name="List Table 5 Dark Accent 6" w:uiPriority="50"/>
+    <w:lsdException w:name="List Table 6 Colorful Accent 6" w:uiPriority="51"/>
+    <w:lsdException w:name="List Table 7 Colorful Accent 6" w:uiPriority="52"/>
+    <w:lsdException w:name="Mention" w:semiHidden="1" w:unhideWhenUsed="1"/>
+    <w:lsdException w:name="Smart Hyperlink" w:semiHidden="1" w:unhideWhenUsed="1"/>
+    <w:lsdException w:name="Hashtag" w:semiHidden="1" w:unhideWhenUsed="1"/>
+    <w:lsdException w:name="Unresolved Mention" w:semiHidden="1" w:unhideWhenUsed="1"/>
+    <w:lsdException w:name="Smart Link" w:semiHidden="1" w:unhideWhenUsed="1"/>
   </w:latentStyles>
-  <w:style w:type="paragraph" w:default="1" w:styleId="Normal">
+  <w:style w:type="paragraph" w:default="1" w:styleId="a">
     <w:name w:val="Normal"/>
     <w:qFormat/>
   </w:style>
-  <w:style w:type="paragraph" w:styleId="Heading2">
+  <w:style w:type="paragraph" w:styleId="2">
     <w:name w:val="heading 2"/>
-    <w:basedOn w:val="Normal"/>
-    <w:next w:val="Normal"/>
-    <w:link w:val="Heading2Char"/>
+    <w:basedOn w:val="a"/>
+    <w:next w:val="a"/>
+    <w:link w:val="20"/>
     <w:uiPriority w:val="9"/>
     <w:unhideWhenUsed/>
     <w:qFormat/>
@@ -1677,13 +2596,13 @@
       <w:szCs w:val="26"/>
     </w:rPr>
   </w:style>
-  <w:style w:type="character" w:default="1" w:styleId="DefaultParagraphFont">
+  <w:style w:type="character" w:default="1" w:styleId="a0">
     <w:name w:val="Default Paragraph Font"/>
     <w:uiPriority w:val="1"/>
     <w:semiHidden/>
     <w:unhideWhenUsed/>
   </w:style>
-  <w:style w:type="table" w:default="1" w:styleId="TableNormal">
+  <w:style w:type="table" w:default="1" w:styleId="a1">
     <w:name w:val="Normal Table"/>
     <w:uiPriority w:val="99"/>
     <w:semiHidden/>
@@ -1698,16 +2617,16 @@
       </w:tblCellMar>
     </w:tblPr>
   </w:style>
-  <w:style w:type="numbering" w:default="1" w:styleId="NoList">
+  <w:style w:type="numbering" w:default="1" w:styleId="a2">
     <w:name w:val="No List"/>
     <w:uiPriority w:val="99"/>
     <w:semiHidden/>
     <w:unhideWhenUsed/>
   </w:style>
-  <w:style w:type="character" w:customStyle="1" w:styleId="Heading2Char">
-    <w:name w:val="Heading 2 Char"/>
-    <w:basedOn w:val="DefaultParagraphFont"/>
-    <w:link w:val="Heading2"/>
+  <w:style w:type="character" w:customStyle="1" w:styleId="20">
+    <w:name w:val="标题 2 字符"/>
+    <w:basedOn w:val="a0"/>
+    <w:link w:val="2"/>
     <w:uiPriority w:val="9"/>
     <w:rsid w:val="00D841ED"/>
     <w:rPr>
@@ -1719,249 +2638,9 @@
       <w:szCs w:val="26"/>
     </w:rPr>
   </w:style>
-  <w:style w:type="paragraph" w:styleId="ListParagraph">
+  <w:style w:type="paragraph" w:styleId="a3">
     <w:name w:val="List Paragraph"/>
-    <w:basedOn w:val="Normal"/>
-    <w:uiPriority w:val="34"/>
-    <w:qFormat/>
-    <w:rsid w:val="00D841ED"/>
-    <w:pPr>
-      <w:ind w:left="720"/>
-      <w:contextualSpacing/>
-    </w:pPr>
-  </w:style>
-</w:styles>
-</file>
-
-<file path=word/stylesWithEffects.xml><?xml version="1.0" encoding="utf-8"?>
-<w:styles xmlns:wpc="http://schemas.microsoft.com/office/word/2010/wordprocessingCanvas" xmlns:mc="http://schemas.openxmlformats.org/markup-compatibility/2006" xmlns:o="urn:schemas-microsoft-com:office:office" xmlns:r="http://schemas.openxmlformats.org/officeDocument/2006/relationships" xmlns:m="http://schemas.openxmlformats.org/officeDocument/2006/math" xmlns:v="urn:schemas-microsoft-com:vml" xmlns:wp14="http://schemas.microsoft.com/office/word/2010/wordprocessingDrawing" xmlns:wp="http://schemas.openxmlformats.org/drawingml/2006/wordprocessingDrawing" xmlns:w10="urn:schemas-microsoft-com:office:word" xmlns:w="http://schemas.openxmlformats.org/wordprocessingml/2006/main" xmlns:w14="http://schemas.microsoft.com/office/word/2010/wordml" xmlns:wpg="http://schemas.microsoft.com/office/word/2010/wordprocessingGroup" xmlns:wpi="http://schemas.microsoft.com/office/word/2010/wordprocessingInk" xmlns:wne="http://schemas.microsoft.com/office/word/2006/wordml" xmlns:wps="http://schemas.microsoft.com/office/word/2010/wordprocessingShape" mc:Ignorable="w14 wp14">
-  <w:docDefaults>
-    <w:rPrDefault>
-      <w:rPr>
-        <w:rFonts w:asciiTheme="minorHAnsi" w:eastAsiaTheme="minorHAnsi" w:hAnsiTheme="minorHAnsi" w:cstheme="minorBidi"/>
-        <w:sz w:val="22"/>
-        <w:szCs w:val="22"/>
-        <w:lang w:val="en-AU" w:eastAsia="en-US" w:bidi="ar-SA"/>
-      </w:rPr>
-    </w:rPrDefault>
-    <w:pPrDefault>
-      <w:pPr>
-        <w:spacing w:after="200" w:line="276" w:lineRule="auto"/>
-      </w:pPr>
-    </w:pPrDefault>
-  </w:docDefaults>
-  <w:latentStyles w:defLockedState="0" w:defUIPriority="99" w:defSemiHidden="1" w:defUnhideWhenUsed="1" w:defQFormat="0" w:count="267">
-    <w:lsdException w:name="Normal" w:semiHidden="0" w:uiPriority="0" w:unhideWhenUsed="0" w:qFormat="1"/>
-    <w:lsdException w:name="heading 1" w:semiHidden="0" w:uiPriority="9" w:unhideWhenUsed="0" w:qFormat="1"/>
-    <w:lsdException w:name="heading 2" w:uiPriority="9" w:qFormat="1"/>
-    <w:lsdException w:name="heading 3" w:uiPriority="9" w:qFormat="1"/>
-    <w:lsdException w:name="heading 4" w:uiPriority="9" w:qFormat="1"/>
-    <w:lsdException w:name="heading 5" w:uiPriority="9" w:qFormat="1"/>
-    <w:lsdException w:name="heading 6" w:uiPriority="9" w:qFormat="1"/>
-    <w:lsdException w:name="heading 7" w:uiPriority="9" w:qFormat="1"/>
-    <w:lsdException w:name="heading 8" w:uiPriority="9" w:qFormat="1"/>
-    <w:lsdException w:name="heading 9" w:uiPriority="9" w:qFormat="1"/>
-    <w:lsdException w:name="toc 1" w:uiPriority="39"/>
-    <w:lsdException w:name="toc 2" w:uiPriority="39"/>
-    <w:lsdException w:name="toc 3" w:uiPriority="39"/>
-    <w:lsdException w:name="toc 4" w:uiPriority="39"/>
-    <w:lsdException w:name="toc 5" w:uiPriority="39"/>
-    <w:lsdException w:name="toc 6" w:uiPriority="39"/>
-    <w:lsdException w:name="toc 7" w:uiPriority="39"/>
-    <w:lsdException w:name="toc 8" w:uiPriority="39"/>
-    <w:lsdException w:name="toc 9" w:uiPriority="39"/>
-    <w:lsdException w:name="caption" w:uiPriority="35" w:qFormat="1"/>
-    <w:lsdException w:name="Title" w:semiHidden="0" w:uiPriority="10" w:unhideWhenUsed="0" w:qFormat="1"/>
-    <w:lsdException w:name="Default Paragraph Font" w:uiPriority="1"/>
-    <w:lsdException w:name="Subtitle" w:semiHidden="0" w:uiPriority="11" w:unhideWhenUsed="0" w:qFormat="1"/>
-    <w:lsdException w:name="Strong" w:semiHidden="0" w:uiPriority="22" w:unhideWhenUsed="0" w:qFormat="1"/>
-    <w:lsdException w:name="Emphasis" w:semiHidden="0" w:uiPriority="20" w:unhideWhenUsed="0" w:qFormat="1"/>
-    <w:lsdException w:name="Table Grid" w:semiHidden="0" w:uiPriority="59" w:unhideWhenUsed="0"/>
-    <w:lsdException w:name="Placeholder Text" w:unhideWhenUsed="0"/>
-    <w:lsdException w:name="No Spacing" w:semiHidden="0" w:uiPriority="1" w:unhideWhenUsed="0" w:qFormat="1"/>
-    <w:lsdException w:name="Light Shading" w:semiHidden="0" w:uiPriority="60" w:unhideWhenUsed="0"/>
-    <w:lsdException w:name="Light List" w:semiHidden="0" w:uiPriority="61" w:unhideWhenUsed="0"/>
-    <w:lsdException w:name="Light Grid" w:semiHidden="0" w:uiPriority="62" w:unhideWhenUsed="0"/>
-    <w:lsdException w:name="Medium Shading 1" w:semiHidden="0" w:uiPriority="63" w:unhideWhenUsed="0"/>
-    <w:lsdException w:name="Medium Shading 2" w:semiHidden="0" w:uiPriority="64" w:unhideWhenUsed="0"/>
-    <w:lsdException w:name="Medium List 1" w:semiHidden="0" w:uiPriority="65" w:unhideWhenUsed="0"/>
-    <w:lsdException w:name="Medium List 2" w:semiHidden="0" w:uiPriority="66" w:unhideWhenUsed="0"/>
-    <w:lsdException w:name="Medium Grid 1" w:semiHidden="0" w:uiPriority="67" w:unhideWhenUsed="0"/>
-    <w:lsdException w:name="Medium Grid 2" w:semiHidden="0" w:uiPriority="68" w:unhideWhenUsed="0"/>
-    <w:lsdException w:name="Medium Grid 3" w:semiHidden="0" w:uiPriority="69" w:unhideWhenUsed="0"/>
-    <w:lsdException w:name="Dark List" w:semiHidden="0" w:uiPriority="70" w:unhideWhenUsed="0"/>
-    <w:lsdException w:name="Colorful Shading" w:semiHidden="0" w:uiPriority="71" w:unhideWhenUsed="0"/>
-    <w:lsdException w:name="Colorful List" w:semiHidden="0" w:uiPriority="72" w:unhideWhenUsed="0"/>
-    <w:lsdException w:name="Colorful Grid" w:semiHidden="0" w:uiPriority="73" w:unhideWhenUsed="0"/>
-    <w:lsdException w:name="Light Shading Accent 1" w:semiHidden="0" w:uiPriority="60" w:unhideWhenUsed="0"/>
-    <w:lsdException w:name="Light List Accent 1" w:semiHidden="0" w:uiPriority="61" w:unhideWhenUsed="0"/>
-    <w:lsdException w:name="Light Grid Accent 1" w:semiHidden="0" w:uiPriority="62" w:unhideWhenUsed="0"/>
-    <w:lsdException w:name="Medium Shading 1 Accent 1" w:semiHidden="0" w:uiPriority="63" w:unhideWhenUsed="0"/>
-    <w:lsdException w:name="Medium Shading 2 Accent 1" w:semiHidden="0" w:uiPriority="64" w:unhideWhenUsed="0"/>
-    <w:lsdException w:name="Medium List 1 Accent 1" w:semiHidden="0" w:uiPriority="65" w:unhideWhenUsed="0"/>
-    <w:lsdException w:name="Revision" w:unhideWhenUsed="0"/>
-    <w:lsdException w:name="List Paragraph" w:semiHidden="0" w:uiPriority="34" w:unhideWhenUsed="0" w:qFormat="1"/>
-    <w:lsdException w:name="Quote" w:semiHidden="0" w:uiPriority="29" w:unhideWhenUsed="0" w:qFormat="1"/>
-    <w:lsdException w:name="Intense Quote" w:semiHidden="0" w:uiPriority="30" w:unhideWhenUsed="0" w:qFormat="1"/>
-    <w:lsdException w:name="Medium List 2 Accent 1" w:semiHidden="0" w:uiPriority="66" w:unhideWhenUsed="0"/>
-    <w:lsdException w:name="Medium Grid 1 Accent 1" w:semiHidden="0" w:uiPriority="67" w:unhideWhenUsed="0"/>
-    <w:lsdException w:name="Medium Grid 2 Accent 1" w:semiHidden="0" w:uiPriority="68" w:unhideWhenUsed="0"/>
-    <w:lsdException w:name="Medium Grid 3 Accent 1" w:semiHidden="0" w:uiPriority="69" w:unhideWhenUsed="0"/>
-    <w:lsdException w:name="Dark List Accent 1" w:semiHidden="0" w:uiPriority="70" w:unhideWhenUsed="0"/>
-    <w:lsdException w:name="Colorful Shading Accent 1" w:semiHidden="0" w:uiPriority="71" w:unhideWhenUsed="0"/>
-    <w:lsdException w:name="Colorful List Accent 1" w:semiHidden="0" w:uiPriority="72" w:unhideWhenUsed="0"/>
-    <w:lsdException w:name="Colorful Grid Accent 1" w:semiHidden="0" w:uiPriority="73" w:unhideWhenUsed="0"/>
-    <w:lsdException w:name="Light Shading Accent 2" w:semiHidden="0" w:uiPriority="60" w:unhideWhenUsed="0"/>
-    <w:lsdException w:name="Light List Accent 2" w:semiHidden="0" w:uiPriority="61" w:unhideWhenUsed="0"/>
-    <w:lsdException w:name="Light Grid Accent 2" w:semiHidden="0" w:uiPriority="62" w:unhideWhenUsed="0"/>
-    <w:lsdException w:name="Medium Shading 1 Accent 2" w:semiHidden="0" w:uiPriority="63" w:unhideWhenUsed="0"/>
-    <w:lsdException w:name="Medium Shading 2 Accent 2" w:semiHidden="0" w:uiPriority="64" w:unhideWhenUsed="0"/>
-    <w:lsdException w:name="Medium List 1 Accent 2" w:semiHidden="0" w:uiPriority="65" w:unhideWhenUsed="0"/>
-    <w:lsdException w:name="Medium List 2 Accent 2" w:semiHidden="0" w:uiPriority="66" w:unhideWhenUsed="0"/>
-    <w:lsdException w:name="Medium Grid 1 Accent 2" w:semiHidden="0" w:uiPriority="67" w:unhideWhenUsed="0"/>
-    <w:lsdException w:name="Medium Grid 2 Accent 2" w:semiHidden="0" w:uiPriority="68" w:unhideWhenUsed="0"/>
-    <w:lsdException w:name="Medium Grid 3 Accent 2" w:semiHidden="0" w:uiPriority="69" w:unhideWhenUsed="0"/>
-    <w:lsdException w:name="Dark List Accent 2" w:semiHidden="0" w:uiPriority="70" w:unhideWhenUsed="0"/>
-    <w:lsdException w:name="Colorful Shading Accent 2" w:semiHidden="0" w:uiPriority="71" w:unhideWhenUsed="0"/>
-    <w:lsdException w:name="Colorful List Accent 2" w:semiHidden="0" w:uiPriority="72" w:unhideWhenUsed="0"/>
-    <w:lsdException w:name="Colorful Grid Accent 2" w:semiHidden="0" w:uiPriority="73" w:unhideWhenUsed="0"/>
-    <w:lsdException w:name="Light Shading Accent 3" w:semiHidden="0" w:uiPriority="60" w:unhideWhenUsed="0"/>
-    <w:lsdException w:name="Light List Accent 3" w:semiHidden="0" w:uiPriority="61" w:unhideWhenUsed="0"/>
-    <w:lsdException w:name="Light Grid Accent 3" w:semiHidden="0" w:uiPriority="62" w:unhideWhenUsed="0"/>
-    <w:lsdException w:name="Medium Shading 1 Accent 3" w:semiHidden="0" w:uiPriority="63" w:unhideWhenUsed="0"/>
-    <w:lsdException w:name="Medium Shading 2 Accent 3" w:semiHidden="0" w:uiPriority="64" w:unhideWhenUsed="0"/>
-    <w:lsdException w:name="Medium List 1 Accent 3" w:semiHidden="0" w:uiPriority="65" w:unhideWhenUsed="0"/>
-    <w:lsdException w:name="Medium List 2 Accent 3" w:semiHidden="0" w:uiPriority="66" w:unhideWhenUsed="0"/>
-    <w:lsdException w:name="Medium Grid 1 Accent 3" w:semiHidden="0" w:uiPriority="67" w:unhideWhenUsed="0"/>
-    <w:lsdException w:name="Medium Grid 2 Accent 3" w:semiHidden="0" w:uiPriority="68" w:unhideWhenUsed="0"/>
-    <w:lsdException w:name="Medium Grid 3 Accent 3" w:semiHidden="0" w:uiPriority="69" w:unhideWhenUsed="0"/>
-    <w:lsdException w:name="Dark List Accent 3" w:semiHidden="0" w:uiPriority="70" w:unhideWhenUsed="0"/>
-    <w:lsdException w:name="Colorful Shading Accent 3" w:semiHidden="0" w:uiPriority="71" w:unhideWhenUsed="0"/>
-    <w:lsdException w:name="Colorful List Accent 3" w:semiHidden="0" w:uiPriority="72" w:unhideWhenUsed="0"/>
-    <w:lsdException w:name="Colorful Grid Accent 3" w:semiHidden="0" w:uiPriority="73" w:unhideWhenUsed="0"/>
-    <w:lsdException w:name="Light Shading Accent 4" w:semiHidden="0" w:uiPriority="60" w:unhideWhenUsed="0"/>
-    <w:lsdException w:name="Light List Accent 4" w:semiHidden="0" w:uiPriority="61" w:unhideWhenUsed="0"/>
-    <w:lsdException w:name="Light Grid Accent 4" w:semiHidden="0" w:uiPriority="62" w:unhideWhenUsed="0"/>
-    <w:lsdException w:name="Medium Shading 1 Accent 4" w:semiHidden="0" w:uiPriority="63" w:unhideWhenUsed="0"/>
-    <w:lsdException w:name="Medium Shading 2 Accent 4" w:semiHidden="0" w:uiPriority="64" w:unhideWhenUsed="0"/>
-    <w:lsdException w:name="Medium List 1 Accent 4" w:semiHidden="0" w:uiPriority="65" w:unhideWhenUsed="0"/>
-    <w:lsdException w:name="Medium List 2 Accent 4" w:semiHidden="0" w:uiPriority="66" w:unhideWhenUsed="0"/>
-    <w:lsdException w:name="Medium Grid 1 Accent 4" w:semiHidden="0" w:uiPriority="67" w:unhideWhenUsed="0"/>
-    <w:lsdException w:name="Medium Grid 2 Accent 4" w:semiHidden="0" w:uiPriority="68" w:unhideWhenUsed="0"/>
-    <w:lsdException w:name="Medium Grid 3 Accent 4" w:semiHidden="0" w:uiPriority="69" w:unhideWhenUsed="0"/>
-    <w:lsdException w:name="Dark List Accent 4" w:semiHidden="0" w:uiPriority="70" w:unhideWhenUsed="0"/>
-    <w:lsdException w:name="Colorful Shading Accent 4" w:semiHidden="0" w:uiPriority="71" w:unhideWhenUsed="0"/>
-    <w:lsdException w:name="Colorful List Accent 4" w:semiHidden="0" w:uiPriority="72" w:unhideWhenUsed="0"/>
-    <w:lsdException w:name="Colorful Grid Accent 4" w:semiHidden="0" w:uiPriority="73" w:unhideWhenUsed="0"/>
-    <w:lsdException w:name="Light Shading Accent 5" w:semiHidden="0" w:uiPriority="60" w:unhideWhenUsed="0"/>
-    <w:lsdException w:name="Light List Accent 5" w:semiHidden="0" w:uiPriority="61" w:unhideWhenUsed="0"/>
-    <w:lsdException w:name="Light Grid Accent 5" w:semiHidden="0" w:uiPriority="62" w:unhideWhenUsed="0"/>
-    <w:lsdException w:name="Medium Shading 1 Accent 5" w:semiHidden="0" w:uiPriority="63" w:unhideWhenUsed="0"/>
-    <w:lsdException w:name="Medium Shading 2 Accent 5" w:semiHidden="0" w:uiPriority="64" w:unhideWhenUsed="0"/>
-    <w:lsdException w:name="Medium List 1 Accent 5" w:semiHidden="0" w:uiPriority="65" w:unhideWhenUsed="0"/>
-    <w:lsdException w:name="Medium List 2 Accent 5" w:semiHidden="0" w:uiPriority="66" w:unhideWhenUsed="0"/>
-    <w:lsdException w:name="Medium Grid 1 Accent 5" w:semiHidden="0" w:uiPriority="67" w:unhideWhenUsed="0"/>
-    <w:lsdException w:name="Medium Grid 2 Accent 5" w:semiHidden="0" w:uiPriority="68" w:unhideWhenUsed="0"/>
-    <w:lsdException w:name="Medium Grid 3 Accent 5" w:semiHidden="0" w:uiPriority="69" w:unhideWhenUsed="0"/>
-    <w:lsdException w:name="Dark List Accent 5" w:semiHidden="0" w:uiPriority="70" w:unhideWhenUsed="0"/>
-    <w:lsdException w:name="Colorful Shading Accent 5" w:semiHidden="0" w:uiPriority="71" w:unhideWhenUsed="0"/>
-    <w:lsdException w:name="Colorful List Accent 5" w:semiHidden="0" w:uiPriority="72" w:unhideWhenUsed="0"/>
-    <w:lsdException w:name="Colorful Grid Accent 5" w:semiHidden="0" w:uiPriority="73" w:unhideWhenUsed="0"/>
-    <w:lsdException w:name="Light Shading Accent 6" w:semiHidden="0" w:uiPriority="60" w:unhideWhenUsed="0"/>
-    <w:lsdException w:name="Light List Accent 6" w:semiHidden="0" w:uiPriority="61" w:unhideWhenUsed="0"/>
-    <w:lsdException w:name="Light Grid Accent 6" w:semiHidden="0" w:uiPriority="62" w:unhideWhenUsed="0"/>
-    <w:lsdException w:name="Medium Shading 1 Accent 6" w:semiHidden="0" w:uiPriority="63" w:unhideWhenUsed="0"/>
-    <w:lsdException w:name="Medium Shading 2 Accent 6" w:semiHidden="0" w:uiPriority="64" w:unhideWhenUsed="0"/>
-    <w:lsdException w:name="Medium List 1 Accent 6" w:semiHidden="0" w:uiPriority="65" w:unhideWhenUsed="0"/>
-    <w:lsdException w:name="Medium List 2 Accent 6" w:semiHidden="0" w:uiPriority="66" w:unhideWhenUsed="0"/>
-    <w:lsdException w:name="Medium Grid 1 Accent 6" w:semiHidden="0" w:uiPriority="67" w:unhideWhenUsed="0"/>
-    <w:lsdException w:name="Medium Grid 2 Accent 6" w:semiHidden="0" w:uiPriority="68" w:unhideWhenUsed="0"/>
-    <w:lsdException w:name="Medium Grid 3 Accent 6" w:semiHidden="0" w:uiPriority="69" w:unhideWhenUsed="0"/>
-    <w:lsdException w:name="Dark List Accent 6" w:semiHidden="0" w:uiPriority="70" w:unhideWhenUsed="0"/>
-    <w:lsdException w:name="Colorful Shading Accent 6" w:semiHidden="0" w:uiPriority="71" w:unhideWhenUsed="0"/>
-    <w:lsdException w:name="Colorful List Accent 6" w:semiHidden="0" w:uiPriority="72" w:unhideWhenUsed="0"/>
-    <w:lsdException w:name="Colorful Grid Accent 6" w:semiHidden="0" w:uiPriority="73" w:unhideWhenUsed="0"/>
-    <w:lsdException w:name="Subtle Emphasis" w:semiHidden="0" w:uiPriority="19" w:unhideWhenUsed="0" w:qFormat="1"/>
-    <w:lsdException w:name="Intense Emphasis" w:semiHidden="0" w:uiPriority="21" w:unhideWhenUsed="0" w:qFormat="1"/>
-    <w:lsdException w:name="Subtle Reference" w:semiHidden="0" w:uiPriority="31" w:unhideWhenUsed="0" w:qFormat="1"/>
-    <w:lsdException w:name="Intense Reference" w:semiHidden="0" w:uiPriority="32" w:unhideWhenUsed="0" w:qFormat="1"/>
-    <w:lsdException w:name="Book Title" w:semiHidden="0" w:uiPriority="33" w:unhideWhenUsed="0" w:qFormat="1"/>
-    <w:lsdException w:name="Bibliography" w:uiPriority="37"/>
-    <w:lsdException w:name="TOC Heading" w:uiPriority="39" w:qFormat="1"/>
-  </w:latentStyles>
-  <w:style w:type="paragraph" w:default="1" w:styleId="Normal">
-    <w:name w:val="Normal"/>
-    <w:qFormat/>
-  </w:style>
-  <w:style w:type="paragraph" w:styleId="Heading2">
-    <w:name w:val="heading 2"/>
-    <w:basedOn w:val="Normal"/>
-    <w:next w:val="Normal"/>
-    <w:link w:val="Heading2Char"/>
-    <w:uiPriority w:val="9"/>
-    <w:unhideWhenUsed/>
-    <w:qFormat/>
-    <w:rsid w:val="00D841ED"/>
-    <w:pPr>
-      <w:keepNext/>
-      <w:keepLines/>
-      <w:spacing w:before="200" w:after="0"/>
-      <w:outlineLvl w:val="1"/>
-    </w:pPr>
-    <w:rPr>
-      <w:rFonts w:asciiTheme="majorHAnsi" w:eastAsiaTheme="majorEastAsia" w:hAnsiTheme="majorHAnsi" w:cstheme="majorBidi"/>
-      <w:b/>
-      <w:bCs/>
-      <w:color w:val="4F81BD" w:themeColor="accent1"/>
-      <w:sz w:val="26"/>
-      <w:szCs w:val="26"/>
-    </w:rPr>
-  </w:style>
-  <w:style w:type="character" w:default="1" w:styleId="DefaultParagraphFont">
-    <w:name w:val="Default Paragraph Font"/>
-    <w:uiPriority w:val="1"/>
-    <w:semiHidden/>
-    <w:unhideWhenUsed/>
-  </w:style>
-  <w:style w:type="table" w:default="1" w:styleId="TableNormal">
-    <w:name w:val="Normal Table"/>
-    <w:uiPriority w:val="99"/>
-    <w:semiHidden/>
-    <w:unhideWhenUsed/>
-    <w:tblPr>
-      <w:tblInd w:w="0" w:type="dxa"/>
-      <w:tblCellMar>
-        <w:top w:w="0" w:type="dxa"/>
-        <w:left w:w="108" w:type="dxa"/>
-        <w:bottom w:w="0" w:type="dxa"/>
-        <w:right w:w="108" w:type="dxa"/>
-      </w:tblCellMar>
-    </w:tblPr>
-  </w:style>
-  <w:style w:type="numbering" w:default="1" w:styleId="NoList">
-    <w:name w:val="No List"/>
-    <w:uiPriority w:val="99"/>
-    <w:semiHidden/>
-    <w:unhideWhenUsed/>
-  </w:style>
-  <w:style w:type="character" w:customStyle="1" w:styleId="Heading2Char">
-    <w:name w:val="Heading 2 Char"/>
-    <w:basedOn w:val="DefaultParagraphFont"/>
-    <w:link w:val="Heading2"/>
-    <w:uiPriority w:val="9"/>
-    <w:rsid w:val="00D841ED"/>
-    <w:rPr>
-      <w:rFonts w:asciiTheme="majorHAnsi" w:eastAsiaTheme="majorEastAsia" w:hAnsiTheme="majorHAnsi" w:cstheme="majorBidi"/>
-      <w:b/>
-      <w:bCs/>
-      <w:color w:val="4F81BD" w:themeColor="accent1"/>
-      <w:sz w:val="26"/>
-      <w:szCs w:val="26"/>
-    </w:rPr>
-  </w:style>
-  <w:style w:type="paragraph" w:styleId="ListParagraph">
-    <w:name w:val="List Paragraph"/>
-    <w:basedOn w:val="Normal"/>
+    <w:basedOn w:val="a"/>
     <w:uiPriority w:val="34"/>
     <w:qFormat/>
     <w:rsid w:val="00D841ED"/>
@@ -2263,7 +2942,7 @@
 </file>
 
 <file path=customXml/itemProps1.xml><?xml version="1.0" encoding="utf-8"?>
-<ds:datastoreItem xmlns:ds="http://schemas.openxmlformats.org/officeDocument/2006/customXml" ds:itemID="{ACCA0FEA-DECD-42A1-9E9F-36337B70B9C9}">
+<ds:datastoreItem xmlns:ds="http://schemas.openxmlformats.org/officeDocument/2006/customXml" ds:itemID="{167B846E-EB68-47CE-9450-12DA08BF71C5}">
   <ds:schemaRefs>
     <ds:schemaRef ds:uri="http://schemas.openxmlformats.org/officeDocument/2006/bibliography"/>
   </ds:schemaRefs>

</xml_diff>